<commit_message>
Has A RELATIONSHIP TRACKER
</commit_message>
<xml_diff>
--- a/Documentation/Dere Club Web Development Project.docx
+++ b/Documentation/Dere Club Web Development Project.docx
@@ -1,6 +1,6 @@
 
 <file path=word/document.xml><?xml version="1.0" encoding="utf-8"?>
-<w:document xmlns:wpc="http://schemas.microsoft.com/office/word/2010/wordprocessingCanvas" xmlns:cx="http://schemas.microsoft.com/office/drawing/2014/chartex" xmlns:cx1="http://schemas.microsoft.com/office/drawing/2015/9/8/chartex" xmlns:cx2="http://schemas.microsoft.com/office/drawing/2015/10/21/chartex" xmlns:cx3="http://schemas.microsoft.com/office/drawing/2016/5/9/chartex" xmlns:cx4="http://schemas.microsoft.com/office/drawing/2016/5/10/chartex" xmlns:cx5="http://schemas.microsoft.com/office/drawing/2016/5/11/chartex" xmlns:cx6="http://schemas.microsoft.com/office/drawing/2016/5/12/chartex" xmlns:cx7="http://schemas.microsoft.com/office/drawing/2016/5/13/chartex" xmlns:cx8="http://schemas.microsoft.com/office/drawing/2016/5/14/chartex" xmlns:mc="http://schemas.openxmlformats.org/markup-compatibility/2006" xmlns:aink="http://schemas.microsoft.com/office/drawing/2016/ink" xmlns:am3d="http://schemas.microsoft.com/office/drawing/2017/model3d" xmlns:o="urn:schemas-microsoft-com:office:office" xmlns:r="http://schemas.openxmlformats.org/officeDocument/2006/relationships" xmlns:m="http://schemas.openxmlformats.org/officeDocument/2006/math" xmlns:v="urn:schemas-microsoft-com:vml" xmlns:wp14="http://schemas.microsoft.com/office/word/2010/wordprocessingDrawing" xmlns:wp="http://schemas.openxmlformats.org/drawingml/2006/wordprocessingDrawing" xmlns:w10="urn:schemas-microsoft-com:office:word" xmlns:w="http://schemas.openxmlformats.org/wordprocessingml/2006/main" xmlns:w14="http://schemas.microsoft.com/office/word/2010/wordml" xmlns:w15="http://schemas.microsoft.com/office/word/2012/wordml" xmlns:w16cex="http://schemas.microsoft.com/office/word/2018/wordml/cex" xmlns:w16cid="http://schemas.microsoft.com/office/word/2016/wordml/cid" xmlns:w16="http://schemas.microsoft.com/office/word/2018/wordml" xmlns:w16sdtdh="http://schemas.microsoft.com/office/word/2020/wordml/sdtdatahash" xmlns:w16se="http://schemas.microsoft.com/office/word/2015/wordml/symex" xmlns:wpg="http://schemas.microsoft.com/office/word/2010/wordprocessingGroup" xmlns:wpi="http://schemas.microsoft.com/office/word/2010/wordprocessingInk" xmlns:wne="http://schemas.microsoft.com/office/word/2006/wordml" xmlns:wps="http://schemas.microsoft.com/office/word/2010/wordprocessingShape" mc:Ignorable="w14 w15 w16se w16cid w16 w16cex w16sdtdh wp14">
+<w:document xmlns:wpc="http://schemas.microsoft.com/office/word/2010/wordprocessingCanvas" xmlns:cx="http://schemas.microsoft.com/office/drawing/2014/chartex" xmlns:cx1="http://schemas.microsoft.com/office/drawing/2015/9/8/chartex" xmlns:cx2="http://schemas.microsoft.com/office/drawing/2015/10/21/chartex" xmlns:cx3="http://schemas.microsoft.com/office/drawing/2016/5/9/chartex" xmlns:cx4="http://schemas.microsoft.com/office/drawing/2016/5/10/chartex" xmlns:cx5="http://schemas.microsoft.com/office/drawing/2016/5/11/chartex" xmlns:cx6="http://schemas.microsoft.com/office/drawing/2016/5/12/chartex" xmlns:cx7="http://schemas.microsoft.com/office/drawing/2016/5/13/chartex" xmlns:cx8="http://schemas.microsoft.com/office/drawing/2016/5/14/chartex" xmlns:mc="http://schemas.openxmlformats.org/markup-compatibility/2006" xmlns:aink="http://schemas.microsoft.com/office/drawing/2016/ink" xmlns:am3d="http://schemas.microsoft.com/office/drawing/2017/model3d" xmlns:o="urn:schemas-microsoft-com:office:office" xmlns:oel="http://schemas.microsoft.com/office/2019/extlst" xmlns:r="http://schemas.openxmlformats.org/officeDocument/2006/relationships" xmlns:m="http://schemas.openxmlformats.org/officeDocument/2006/math" xmlns:v="urn:schemas-microsoft-com:vml" xmlns:wp14="http://schemas.microsoft.com/office/word/2010/wordprocessingDrawing" xmlns:wp="http://schemas.openxmlformats.org/drawingml/2006/wordprocessingDrawing" xmlns:w10="urn:schemas-microsoft-com:office:word" xmlns:w="http://schemas.openxmlformats.org/wordprocessingml/2006/main" xmlns:w14="http://schemas.microsoft.com/office/word/2010/wordml" xmlns:w15="http://schemas.microsoft.com/office/word/2012/wordml" xmlns:w16cex="http://schemas.microsoft.com/office/word/2018/wordml/cex" xmlns:w16cid="http://schemas.microsoft.com/office/word/2016/wordml/cid" xmlns:w16="http://schemas.microsoft.com/office/word/2018/wordml" xmlns:w16du="http://schemas.microsoft.com/office/word/2023/wordml/word16du" xmlns:w16sdtdh="http://schemas.microsoft.com/office/word/2020/wordml/sdtdatahash" xmlns:w16sdtfl="http://schemas.microsoft.com/office/word/2024/wordml/sdtformatlock" xmlns:w16se="http://schemas.microsoft.com/office/word/2015/wordml/symex" xmlns:wpg="http://schemas.microsoft.com/office/word/2010/wordprocessingGroup" xmlns:wpi="http://schemas.microsoft.com/office/word/2010/wordprocessingInk" xmlns:wne="http://schemas.microsoft.com/office/word/2006/wordml" xmlns:wps="http://schemas.microsoft.com/office/word/2010/wordprocessingShape" mc:Ignorable="w14 w15 w16se w16cid w16 w16cex w16sdtdh w16sdtfl w16du wp14">
   <w:body>
     <w:p>
       <w:pPr>
@@ -71,13 +71,7 @@
         <w:rPr>
           <w:color w:val="0D0D0D" w:themeColor="text1" w:themeTint="F2"/>
         </w:rPr>
-        <w:t xml:space="preserve"> </w:t>
-      </w:r>
-      <w:r>
-        <w:rPr>
-          <w:color w:val="0D0D0D" w:themeColor="text1" w:themeTint="F2"/>
-        </w:rPr>
-        <w:t xml:space="preserve">is a browser-based visual novel and relationship simulation developed as a web application. The game is centered around the concept of </w:t>
+        <w:t xml:space="preserve"> is a browser-based visual novel and relationship simulation developed as a web application. The game is centered around the concept of </w:t>
       </w:r>
       <w:r>
         <w:rPr>
@@ -91,13 +85,7 @@
         <w:rPr>
           <w:color w:val="0D0D0D" w:themeColor="text1" w:themeTint="F2"/>
         </w:rPr>
-        <w:t>, where each character represents a unique personality archetype rather than a stereotype based on ge</w:t>
-      </w:r>
-      <w:r>
-        <w:rPr>
-          <w:color w:val="0D0D0D" w:themeColor="text1" w:themeTint="F2"/>
-        </w:rPr>
-        <w:t>nder. Set in the Creative Arts Club of NU Academy, players interact with students from different backgrounds, cultures, beliefs, and interests while making choices that influence the story and relationships.</w:t>
+        <w:t>, where each character represents a unique personality archetype rather than a stereotype based on gender. Set in the Creative Arts Club of NU Academy, players interact with students from different backgrounds, cultures, beliefs, and interests while making choices that influence the story and relationships.</w:t>
       </w:r>
     </w:p>
     <w:p>
@@ -112,13 +100,7 @@
         <w:rPr>
           <w:color w:val="0D0D0D" w:themeColor="text1" w:themeTint="F2"/>
         </w:rPr>
-        <w:t xml:space="preserve">The project was created to combine storytelling </w:t>
-      </w:r>
-      <w:r>
-        <w:rPr>
-          <w:color w:val="0D0D0D" w:themeColor="text1" w:themeTint="F2"/>
-        </w:rPr>
-        <w:t>with modern web technologies, allowing users to experience an interactive narrative directly through a web browser.</w:t>
+        <w:t>The project was created to combine storytelling with modern web technologies, allowing users to experience an interactive narrative directly through a web browser.</w:t>
       </w:r>
     </w:p>
     <w:p>
@@ -164,13 +146,7 @@
         <w:rPr>
           <w:color w:val="0D0D0D" w:themeColor="text1" w:themeTint="F2"/>
         </w:rPr>
-        <w:t xml:space="preserve"> is to provide an interactive story-driven experience where players can explore different cha</w:t>
-      </w:r>
-      <w:r>
-        <w:rPr>
-          <w:color w:val="0D0D0D" w:themeColor="text1" w:themeTint="F2"/>
-        </w:rPr>
-        <w:t>racter personalities through meaningful conversations and choices while demonstrating the capabilities of HTML, CSS, and JavaScript in creating an engaging web application.</w:t>
+        <w:t xml:space="preserve"> is to provide an interactive story-driven experience where players can explore different character personalities through meaningful conversations and choices while demonstrating the capabilities of HTML, CSS, and JavaScript in creating an engaging web application.</w:t>
       </w:r>
     </w:p>
     <w:p>
@@ -217,13 +193,7 @@
         <w:rPr>
           <w:color w:val="0D0D0D" w:themeColor="text1" w:themeTint="F2"/>
         </w:rPr>
-        <w:t xml:space="preserve">Apply HTML, CSS, and </w:t>
-      </w:r>
-      <w:r>
-        <w:rPr>
-          <w:color w:val="0D0D0D" w:themeColor="text1" w:themeTint="F2"/>
-        </w:rPr>
-        <w:t>JavaScript in a complete web development project.</w:t>
+        <w:t>Apply HTML, CSS, and JavaScript in a complete web development project.</w:t>
       </w:r>
     </w:p>
     <w:p>
@@ -268,13 +238,7 @@
         <w:rPr>
           <w:color w:val="0D0D0D" w:themeColor="text1" w:themeTint="F2"/>
         </w:rPr>
-        <w:t>Implement a dialogue and choice system that affects player progr</w:t>
-      </w:r>
-      <w:r>
-        <w:rPr>
-          <w:color w:val="0D0D0D" w:themeColor="text1" w:themeTint="F2"/>
-        </w:rPr>
-        <w:t>ession.</w:t>
+        <w:t>Implement a dialogue and choice system that affects player progression.</w:t>
       </w:r>
     </w:p>
     <w:p>
@@ -323,13 +287,7 @@
         <w:rPr>
           <w:color w:val="0D0D0D" w:themeColor="text1" w:themeTint="F2"/>
         </w:rPr>
-        <w:t>P</w:t>
-      </w:r>
-      <w:r>
-        <w:rPr>
-          <w:color w:val="0D0D0D" w:themeColor="text1" w:themeTint="F2"/>
-        </w:rPr>
-        <w:t>roject Overview</w:t>
+        <w:t>Project Overview</w:t>
       </w:r>
     </w:p>
     <w:p>
@@ -455,13 +413,7 @@
         <w:rPr>
           <w:color w:val="0D0D0D" w:themeColor="text1" w:themeTint="F2"/>
         </w:rPr>
-        <w:t>Stu</w:t>
-      </w:r>
-      <w:r>
-        <w:rPr>
-          <w:color w:val="0D0D0D" w:themeColor="text1" w:themeTint="F2"/>
-        </w:rPr>
-        <w:t>dents interested in character-driven games</w:t>
+        <w:t>Students interested in character-driven games</w:t>
       </w:r>
     </w:p>
     <w:p>
@@ -516,13 +468,7 @@
         <w:rPr>
           <w:color w:val="0D0D0D" w:themeColor="text1" w:themeTint="F2"/>
         </w:rPr>
-        <w:t xml:space="preserve"> is an interactive visual novel that takes place in the Creative Arts Club at NU Academy. Players become a new club member and gradu</w:t>
-      </w:r>
-      <w:r>
-        <w:rPr>
-          <w:color w:val="0D0D0D" w:themeColor="text1" w:themeTint="F2"/>
-        </w:rPr>
-        <w:t>ally meet classmates with different personalities inspired by various dere archetypes.</w:t>
+        <w:t xml:space="preserve"> is an interactive visual novel that takes place in the Creative Arts Club at NU Academy. Players become a new club member and gradually meet classmates with different personalities inspired by various dere archetypes.</w:t>
       </w:r>
     </w:p>
     <w:p>
@@ -554,13 +500,7 @@
         <w:rPr>
           <w:color w:val="0D0D0D" w:themeColor="text1" w:themeTint="F2"/>
         </w:rPr>
-        <w:t>Fea</w:t>
-      </w:r>
-      <w:r>
-        <w:rPr>
-          <w:color w:val="0D0D0D" w:themeColor="text1" w:themeTint="F2"/>
-        </w:rPr>
-        <w:t>tures and Functionalities</w:t>
+        <w:t>Features and Functionalities</w:t>
       </w:r>
     </w:p>
     <w:p>
@@ -650,7 +590,7 @@
         <w:rPr>
           <w:color w:val="0D0D0D" w:themeColor="text1" w:themeTint="F2"/>
         </w:rPr>
-        <w:t>Relationship Progress Tracking</w:t>
+        <w:t>Save and Continue System</w:t>
       </w:r>
     </w:p>
     <w:p>
@@ -665,59 +605,7 @@
         <w:rPr>
           <w:color w:val="0D0D0D" w:themeColor="text1" w:themeTint="F2"/>
         </w:rPr>
-        <w:t xml:space="preserve">Save and Continue System </w:t>
-      </w:r>
-      <w:r>
-        <w:rPr>
-          <w:i/>
-          <w:iCs/>
-          <w:color w:val="0D0D0D" w:themeColor="text1" w:themeTint="F2"/>
-        </w:rPr>
-        <w:t>(if implemented)</w:t>
-      </w:r>
-    </w:p>
-    <w:p>
-      <w:pPr>
-        <w:pStyle w:val="Compact"/>
-        <w:ind w:left="360"/>
-        <w:rPr>
-          <w:color w:val="0D0D0D" w:themeColor="text1" w:themeTint="F2"/>
-        </w:rPr>
-      </w:pPr>
-      <w:r>
-        <w:rPr>
-          <w:color w:val="0D0D0D" w:themeColor="text1" w:themeTint="F2"/>
-        </w:rPr>
-        <w:t xml:space="preserve">Gallery </w:t>
-      </w:r>
-      <w:r>
-        <w:rPr>
-          <w:i/>
-          <w:iCs/>
-          <w:color w:val="0D0D0D" w:themeColor="text1" w:themeTint="F2"/>
-        </w:rPr>
-        <w:t>(future implementation)</w:t>
-      </w:r>
-    </w:p>
-    <w:p>
-      <w:pPr>
-        <w:pStyle w:val="Compact"/>
-        <w:ind w:left="360"/>
-        <w:rPr>
-          <w:color w:val="0D0D0D" w:themeColor="text1" w:themeTint="F2"/>
-        </w:rPr>
-      </w:pPr>
-      <w:r>
-        <w:rPr>
-          <w:color w:val="0D0D0D" w:themeColor="text1" w:themeTint="F2"/>
-        </w:rPr>
-        <w:t>Setting</w:t>
-      </w:r>
-      <w:r>
-        <w:rPr>
-          <w:color w:val="0D0D0D" w:themeColor="text1" w:themeTint="F2"/>
-        </w:rPr>
-        <w:t>s Menu</w:t>
+        <w:t>Settings Menu</w:t>
       </w:r>
     </w:p>
     <w:p>
@@ -766,13 +654,7 @@
         <w:rPr>
           <w:color w:val="0D0D0D" w:themeColor="text1" w:themeTint="F2"/>
         </w:rPr>
-        <w:t>P</w:t>
-      </w:r>
-      <w:r>
-        <w:rPr>
-          <w:color w:val="0D0D0D" w:themeColor="text1" w:themeTint="F2"/>
-        </w:rPr>
-        <w:t>lanning</w:t>
+        <w:t>Planning</w:t>
       </w:r>
     </w:p>
     <w:p>
@@ -888,7 +770,7 @@
           <w:rStyle w:val="VerbatimChar"/>
           <w:color w:val="0D0D0D" w:themeColor="text1" w:themeTint="F2"/>
         </w:rPr>
-        <w:t>Settings</w:t>
+        <w:t>Setting</w:t>
       </w:r>
     </w:p>
     <w:p>
@@ -908,7 +790,7 @@
           <w:rStyle w:val="VerbatimChar"/>
           <w:color w:val="0D0D0D" w:themeColor="text1" w:themeTint="F2"/>
         </w:rPr>
-        <w:t>Credits</w:t>
+        <w:t>About</w:t>
       </w:r>
     </w:p>
     <w:p>
@@ -934,133 +816,253 @@
         <w:rPr>
           <w:color w:val="0D0D0D" w:themeColor="text1" w:themeTint="F2"/>
         </w:rPr>
+        <w:lastRenderedPageBreak/>
         <w:t>Wireframe</w:t>
       </w:r>
     </w:p>
     <w:p>
       <w:pPr>
-        <w:pStyle w:val="FirstParagraph"/>
-        <w:ind w:left="360"/>
-        <w:rPr>
-          <w:color w:val="0D0D0D" w:themeColor="text1" w:themeTint="F2"/>
-        </w:rPr>
-      </w:pPr>
-      <w:r>
-        <w:rPr>
-          <w:color w:val="0D0D0D" w:themeColor="text1" w:themeTint="F2"/>
-        </w:rPr>
-        <w:t>The website was first planned using simple wireframes to determine the placement of:</w:t>
-      </w:r>
-    </w:p>
-    <w:p>
-      <w:pPr>
-        <w:pStyle w:val="Compact"/>
-        <w:ind w:left="360"/>
-        <w:rPr>
-          <w:color w:val="0D0D0D" w:themeColor="text1" w:themeTint="F2"/>
-        </w:rPr>
-      </w:pPr>
-      <w:r>
-        <w:rPr>
-          <w:color w:val="0D0D0D" w:themeColor="text1" w:themeTint="F2"/>
-        </w:rPr>
-        <w:t>Background image</w:t>
-      </w:r>
-    </w:p>
-    <w:p>
-      <w:pPr>
-        <w:pStyle w:val="Compact"/>
-        <w:ind w:left="360"/>
-        <w:rPr>
-          <w:color w:val="0D0D0D" w:themeColor="text1" w:themeTint="F2"/>
-        </w:rPr>
-      </w:pPr>
-      <w:r>
-        <w:rPr>
-          <w:color w:val="0D0D0D" w:themeColor="text1" w:themeTint="F2"/>
-        </w:rPr>
-        <w:t>Character sprite</w:t>
-      </w:r>
-    </w:p>
-    <w:p>
-      <w:pPr>
-        <w:pStyle w:val="Compact"/>
-        <w:ind w:left="360"/>
-        <w:rPr>
-          <w:color w:val="0D0D0D" w:themeColor="text1" w:themeTint="F2"/>
-        </w:rPr>
-      </w:pPr>
-      <w:r>
-        <w:rPr>
-          <w:color w:val="0D0D0D" w:themeColor="text1" w:themeTint="F2"/>
-        </w:rPr>
-        <w:t>Dialogue box</w:t>
-      </w:r>
-    </w:p>
-    <w:p>
-      <w:pPr>
-        <w:pStyle w:val="Compact"/>
-        <w:ind w:left="360"/>
-        <w:rPr>
-          <w:color w:val="0D0D0D" w:themeColor="text1" w:themeTint="F2"/>
-        </w:rPr>
-      </w:pPr>
-      <w:r>
-        <w:rPr>
-          <w:color w:val="0D0D0D" w:themeColor="text1" w:themeTint="F2"/>
-        </w:rPr>
-        <w:t>Player choices</w:t>
-      </w:r>
-    </w:p>
-    <w:p>
-      <w:pPr>
-        <w:pStyle w:val="Compact"/>
-        <w:ind w:left="360"/>
-        <w:rPr>
-          <w:color w:val="0D0D0D" w:themeColor="text1" w:themeTint="F2"/>
-        </w:rPr>
-      </w:pPr>
-      <w:r>
-        <w:rPr>
-          <w:color w:val="0D0D0D" w:themeColor="text1" w:themeTint="F2"/>
-        </w:rPr>
-        <w:t>Navigat</w:t>
-      </w:r>
-      <w:r>
-        <w:rPr>
-          <w:color w:val="0D0D0D" w:themeColor="text1" w:themeTint="F2"/>
-        </w:rPr>
-        <w:t>ion buttons</w:t>
-      </w:r>
-    </w:p>
-    <w:p>
-      <w:pPr>
-        <w:pStyle w:val="Compact"/>
-        <w:ind w:left="360"/>
-        <w:rPr>
-          <w:color w:val="0D0D0D" w:themeColor="text1" w:themeTint="F2"/>
-        </w:rPr>
-      </w:pPr>
-      <w:r>
-        <w:rPr>
-          <w:color w:val="0D0D0D" w:themeColor="text1" w:themeTint="F2"/>
-        </w:rPr>
-        <w:t>Menu interface</w:t>
-      </w:r>
-    </w:p>
-    <w:p>
-      <w:pPr>
-        <w:pStyle w:val="FirstParagraph"/>
-        <w:ind w:left="360"/>
-        <w:rPr>
-          <w:color w:val="0D0D0D" w:themeColor="text1" w:themeTint="F2"/>
-        </w:rPr>
-      </w:pPr>
-      <w:r>
-        <w:rPr>
-          <w:color w:val="0D0D0D" w:themeColor="text1" w:themeTint="F2"/>
-        </w:rPr>
-        <w:t>These wireframes helped organize the layout before implementation.</w:t>
+        <w:ind w:left="360"/>
+        <w:rPr>
+          <w:color w:val="0D0D0D" w:themeColor="text1" w:themeTint="F2"/>
+        </w:rPr>
+      </w:pPr>
+      <w:r>
+        <w:rPr>
+          <w:noProof/>
+          <w:color w:val="0D0D0D" w:themeColor="text1" w:themeTint="F2"/>
+        </w:rPr>
+        <w:drawing>
+          <wp:inline distT="0" distB="0" distL="0" distR="0" wp14:anchorId="6B40E5E0" wp14:editId="2397D4F7">
+            <wp:extent cx="5943600" cy="3343275"/>
+            <wp:effectExtent l="0" t="0" r="0" b="0"/>
+            <wp:docPr id="1148880454" name="Picture 14"/>
+            <wp:cNvGraphicFramePr>
+              <a:graphicFrameLocks xmlns:a="http://schemas.openxmlformats.org/drawingml/2006/main" noChangeAspect="1"/>
+            </wp:cNvGraphicFramePr>
+            <a:graphic xmlns:a="http://schemas.openxmlformats.org/drawingml/2006/main">
+              <a:graphicData uri="http://schemas.openxmlformats.org/drawingml/2006/picture">
+                <pic:pic xmlns:pic="http://schemas.openxmlformats.org/drawingml/2006/picture">
+                  <pic:nvPicPr>
+                    <pic:cNvPr id="1148880454" name="Picture 1148880454"/>
+                    <pic:cNvPicPr/>
+                  </pic:nvPicPr>
+                  <pic:blipFill>
+                    <a:blip r:embed="rId6">
+                      <a:extLst>
+                        <a:ext uri="{28A0092B-C50C-407E-A947-70E740481C1C}">
+                          <a14:useLocalDpi xmlns:a14="http://schemas.microsoft.com/office/drawing/2010/main" val="0"/>
+                        </a:ext>
+                      </a:extLst>
+                    </a:blip>
+                    <a:stretch>
+                      <a:fillRect/>
+                    </a:stretch>
+                  </pic:blipFill>
+                  <pic:spPr>
+                    <a:xfrm>
+                      <a:off x="0" y="0"/>
+                      <a:ext cx="5943600" cy="3343275"/>
+                    </a:xfrm>
+                    <a:prstGeom prst="rect">
+                      <a:avLst/>
+                    </a:prstGeom>
+                  </pic:spPr>
+                </pic:pic>
+              </a:graphicData>
+            </a:graphic>
+          </wp:inline>
+        </w:drawing>
+      </w:r>
+      <w:r>
+        <w:rPr>
+          <w:noProof/>
+          <w:color w:val="0D0D0D" w:themeColor="text1" w:themeTint="F2"/>
+        </w:rPr>
+        <w:drawing>
+          <wp:inline distT="0" distB="0" distL="0" distR="0" wp14:anchorId="1EE6B07C" wp14:editId="12D1C912">
+            <wp:extent cx="5943600" cy="3343275"/>
+            <wp:effectExtent l="0" t="0" r="0" b="0"/>
+            <wp:docPr id="222468642" name="Picture 15"/>
+            <wp:cNvGraphicFramePr>
+              <a:graphicFrameLocks xmlns:a="http://schemas.openxmlformats.org/drawingml/2006/main" noChangeAspect="1"/>
+            </wp:cNvGraphicFramePr>
+            <a:graphic xmlns:a="http://schemas.openxmlformats.org/drawingml/2006/main">
+              <a:graphicData uri="http://schemas.openxmlformats.org/drawingml/2006/picture">
+                <pic:pic xmlns:pic="http://schemas.openxmlformats.org/drawingml/2006/picture">
+                  <pic:nvPicPr>
+                    <pic:cNvPr id="222468642" name="Picture 222468642"/>
+                    <pic:cNvPicPr/>
+                  </pic:nvPicPr>
+                  <pic:blipFill>
+                    <a:blip r:embed="rId7">
+                      <a:extLst>
+                        <a:ext uri="{28A0092B-C50C-407E-A947-70E740481C1C}">
+                          <a14:useLocalDpi xmlns:a14="http://schemas.microsoft.com/office/drawing/2010/main" val="0"/>
+                        </a:ext>
+                      </a:extLst>
+                    </a:blip>
+                    <a:stretch>
+                      <a:fillRect/>
+                    </a:stretch>
+                  </pic:blipFill>
+                  <pic:spPr>
+                    <a:xfrm>
+                      <a:off x="0" y="0"/>
+                      <a:ext cx="5943600" cy="3343275"/>
+                    </a:xfrm>
+                    <a:prstGeom prst="rect">
+                      <a:avLst/>
+                    </a:prstGeom>
+                  </pic:spPr>
+                </pic:pic>
+              </a:graphicData>
+            </a:graphic>
+          </wp:inline>
+        </w:drawing>
+      </w:r>
+      <w:r>
+        <w:rPr>
+          <w:noProof/>
+          <w:color w:val="0D0D0D" w:themeColor="text1" w:themeTint="F2"/>
+        </w:rPr>
+        <w:lastRenderedPageBreak/>
+        <w:drawing>
+          <wp:inline distT="0" distB="0" distL="0" distR="0" wp14:anchorId="6D91576D" wp14:editId="151B7A01">
+            <wp:extent cx="5943600" cy="3343275"/>
+            <wp:effectExtent l="0" t="0" r="0" b="0"/>
+            <wp:docPr id="884528511" name="Picture 16"/>
+            <wp:cNvGraphicFramePr>
+              <a:graphicFrameLocks xmlns:a="http://schemas.openxmlformats.org/drawingml/2006/main" noChangeAspect="1"/>
+            </wp:cNvGraphicFramePr>
+            <a:graphic xmlns:a="http://schemas.openxmlformats.org/drawingml/2006/main">
+              <a:graphicData uri="http://schemas.openxmlformats.org/drawingml/2006/picture">
+                <pic:pic xmlns:pic="http://schemas.openxmlformats.org/drawingml/2006/picture">
+                  <pic:nvPicPr>
+                    <pic:cNvPr id="884528511" name="Picture 884528511"/>
+                    <pic:cNvPicPr/>
+                  </pic:nvPicPr>
+                  <pic:blipFill>
+                    <a:blip r:embed="rId8">
+                      <a:extLst>
+                        <a:ext uri="{28A0092B-C50C-407E-A947-70E740481C1C}">
+                          <a14:useLocalDpi xmlns:a14="http://schemas.microsoft.com/office/drawing/2010/main" val="0"/>
+                        </a:ext>
+                      </a:extLst>
+                    </a:blip>
+                    <a:stretch>
+                      <a:fillRect/>
+                    </a:stretch>
+                  </pic:blipFill>
+                  <pic:spPr>
+                    <a:xfrm>
+                      <a:off x="0" y="0"/>
+                      <a:ext cx="5943600" cy="3343275"/>
+                    </a:xfrm>
+                    <a:prstGeom prst="rect">
+                      <a:avLst/>
+                    </a:prstGeom>
+                  </pic:spPr>
+                </pic:pic>
+              </a:graphicData>
+            </a:graphic>
+          </wp:inline>
+        </w:drawing>
+      </w:r>
+      <w:r>
+        <w:rPr>
+          <w:noProof/>
+          <w:color w:val="0D0D0D" w:themeColor="text1" w:themeTint="F2"/>
+        </w:rPr>
+        <w:drawing>
+          <wp:inline distT="0" distB="0" distL="0" distR="0" wp14:anchorId="47DE8C56" wp14:editId="5A243042">
+            <wp:extent cx="5943600" cy="3343275"/>
+            <wp:effectExtent l="0" t="0" r="0" b="0"/>
+            <wp:docPr id="1486507469" name="Picture 17"/>
+            <wp:cNvGraphicFramePr>
+              <a:graphicFrameLocks xmlns:a="http://schemas.openxmlformats.org/drawingml/2006/main" noChangeAspect="1"/>
+            </wp:cNvGraphicFramePr>
+            <a:graphic xmlns:a="http://schemas.openxmlformats.org/drawingml/2006/main">
+              <a:graphicData uri="http://schemas.openxmlformats.org/drawingml/2006/picture">
+                <pic:pic xmlns:pic="http://schemas.openxmlformats.org/drawingml/2006/picture">
+                  <pic:nvPicPr>
+                    <pic:cNvPr id="1486507469" name="Picture 1486507469"/>
+                    <pic:cNvPicPr/>
+                  </pic:nvPicPr>
+                  <pic:blipFill>
+                    <a:blip r:embed="rId9">
+                      <a:extLst>
+                        <a:ext uri="{28A0092B-C50C-407E-A947-70E740481C1C}">
+                          <a14:useLocalDpi xmlns:a14="http://schemas.microsoft.com/office/drawing/2010/main" val="0"/>
+                        </a:ext>
+                      </a:extLst>
+                    </a:blip>
+                    <a:stretch>
+                      <a:fillRect/>
+                    </a:stretch>
+                  </pic:blipFill>
+                  <pic:spPr>
+                    <a:xfrm>
+                      <a:off x="0" y="0"/>
+                      <a:ext cx="5943600" cy="3343275"/>
+                    </a:xfrm>
+                    <a:prstGeom prst="rect">
+                      <a:avLst/>
+                    </a:prstGeom>
+                  </pic:spPr>
+                </pic:pic>
+              </a:graphicData>
+            </a:graphic>
+          </wp:inline>
+        </w:drawing>
+      </w:r>
+      <w:r>
+        <w:rPr>
+          <w:noProof/>
+          <w:color w:val="0D0D0D" w:themeColor="text1" w:themeTint="F2"/>
+        </w:rPr>
+        <w:lastRenderedPageBreak/>
+        <w:drawing>
+          <wp:inline distT="0" distB="0" distL="0" distR="0" wp14:anchorId="56232DF6" wp14:editId="395C4126">
+            <wp:extent cx="5943600" cy="3343275"/>
+            <wp:effectExtent l="0" t="0" r="0" b="0"/>
+            <wp:docPr id="1453694947" name="Picture 18"/>
+            <wp:cNvGraphicFramePr>
+              <a:graphicFrameLocks xmlns:a="http://schemas.openxmlformats.org/drawingml/2006/main" noChangeAspect="1"/>
+            </wp:cNvGraphicFramePr>
+            <a:graphic xmlns:a="http://schemas.openxmlformats.org/drawingml/2006/main">
+              <a:graphicData uri="http://schemas.openxmlformats.org/drawingml/2006/picture">
+                <pic:pic xmlns:pic="http://schemas.openxmlformats.org/drawingml/2006/picture">
+                  <pic:nvPicPr>
+                    <pic:cNvPr id="1453694947" name="Picture 1453694947"/>
+                    <pic:cNvPicPr/>
+                  </pic:nvPicPr>
+                  <pic:blipFill>
+                    <a:blip r:embed="rId10">
+                      <a:extLst>
+                        <a:ext uri="{28A0092B-C50C-407E-A947-70E740481C1C}">
+                          <a14:useLocalDpi xmlns:a14="http://schemas.microsoft.com/office/drawing/2010/main" val="0"/>
+                        </a:ext>
+                      </a:extLst>
+                    </a:blip>
+                    <a:stretch>
+                      <a:fillRect/>
+                    </a:stretch>
+                  </pic:blipFill>
+                  <pic:spPr>
+                    <a:xfrm>
+                      <a:off x="0" y="0"/>
+                      <a:ext cx="5943600" cy="3343275"/>
+                    </a:xfrm>
+                    <a:prstGeom prst="rect">
+                      <a:avLst/>
+                    </a:prstGeom>
+                  </pic:spPr>
+                </pic:pic>
+              </a:graphicData>
+            </a:graphic>
+          </wp:inline>
+        </w:drawing>
       </w:r>
     </w:p>
     <w:p>
@@ -1094,13 +1096,7 @@
         <w:rPr>
           <w:color w:val="0D0D0D" w:themeColor="text1" w:themeTint="F2"/>
         </w:rPr>
-        <w:t>T</w:t>
-      </w:r>
-      <w:r>
-        <w:rPr>
-          <w:color w:val="0D0D0D" w:themeColor="text1" w:themeTint="F2"/>
-        </w:rPr>
-        <w:t>echnologies Used</w:t>
+        <w:t>Technologies Used</w:t>
       </w:r>
     </w:p>
     <w:tbl>
@@ -1443,13 +1439,7 @@
         <w:rPr>
           <w:color w:val="0D0D0D" w:themeColor="text1" w:themeTint="F2"/>
         </w:rPr>
-        <w:t>W</w:t>
-      </w:r>
-      <w:r>
-        <w:rPr>
-          <w:color w:val="0D0D0D" w:themeColor="text1" w:themeTint="F2"/>
-        </w:rPr>
-        <w:t>ebsite Design</w:t>
+        <w:t>Website Design</w:t>
       </w:r>
     </w:p>
     <w:p>
@@ -1471,16 +1461,17 @@
     <w:tbl>
       <w:tblPr>
         <w:tblStyle w:val="Table"/>
-        <w:tblW w:w="0" w:type="auto"/>
+        <w:tblW w:w="5398" w:type="dxa"/>
         <w:tblLook w:val="0020" w:firstRow="1" w:lastRow="0" w:firstColumn="0" w:lastColumn="0" w:noHBand="0" w:noVBand="0"/>
       </w:tblPr>
       <w:tblGrid>
-        <w:gridCol w:w="1545"/>
-        <w:gridCol w:w="3882"/>
+        <w:gridCol w:w="1263"/>
+        <w:gridCol w:w="4135"/>
       </w:tblGrid>
       <w:tr>
         <w:trPr>
           <w:cnfStyle w:val="100000000000" w:firstRow="1" w:lastRow="0" w:firstColumn="0" w:lastColumn="0" w:oddVBand="0" w:evenVBand="0" w:oddHBand="0" w:evenHBand="0" w:firstRowFirstColumn="0" w:firstRowLastColumn="0" w:lastRowFirstColumn="0" w:lastRowLastColumn="0"/>
+          <w:trHeight w:val="302"/>
           <w:tblHeader/>
         </w:trPr>
         <w:tc>
@@ -1525,6 +1516,9 @@
         </w:tc>
       </w:tr>
       <w:tr>
+        <w:trPr>
+          <w:trHeight w:val="310"/>
+        </w:trPr>
         <w:tc>
           <w:tcPr>
             <w:tcW w:w="0" w:type="auto"/>
@@ -1567,6 +1561,9 @@
         </w:tc>
       </w:tr>
       <w:tr>
+        <w:trPr>
+          <w:trHeight w:val="302"/>
+        </w:trPr>
         <w:tc>
           <w:tcPr>
             <w:tcW w:w="0" w:type="auto"/>
@@ -1583,6 +1580,7 @@
               <w:rPr>
                 <w:color w:val="0D0D0D" w:themeColor="text1" w:themeTint="F2"/>
               </w:rPr>
+              <w:lastRenderedPageBreak/>
               <w:t>White</w:t>
             </w:r>
           </w:p>
@@ -1609,90 +1607,9 @@
         </w:tc>
       </w:tr>
       <w:tr>
-        <w:tc>
-          <w:tcPr>
-            <w:tcW w:w="0" w:type="auto"/>
-          </w:tcPr>
-          <w:p>
-            <w:pPr>
-              <w:pStyle w:val="Compact"/>
-              <w:ind w:left="360"/>
-              <w:rPr>
-                <w:color w:val="0D0D0D" w:themeColor="text1" w:themeTint="F2"/>
-              </w:rPr>
-            </w:pPr>
-            <w:r>
-              <w:rPr>
-                <w:color w:val="0D0D0D" w:themeColor="text1" w:themeTint="F2"/>
-              </w:rPr>
-              <w:t>Dark Gray</w:t>
-            </w:r>
-          </w:p>
-        </w:tc>
-        <w:tc>
-          <w:tcPr>
-            <w:tcW w:w="0" w:type="auto"/>
-          </w:tcPr>
-          <w:p>
-            <w:pPr>
-              <w:pStyle w:val="Compact"/>
-              <w:ind w:left="360"/>
-              <w:rPr>
-                <w:color w:val="0D0D0D" w:themeColor="text1" w:themeTint="F2"/>
-              </w:rPr>
-            </w:pPr>
-            <w:r>
-              <w:rPr>
-                <w:color w:val="0D0D0D" w:themeColor="text1" w:themeTint="F2"/>
-              </w:rPr>
-              <w:t>Dialogue box</w:t>
-            </w:r>
-          </w:p>
-        </w:tc>
-      </w:tr>
-      <w:tr>
-        <w:tc>
-          <w:tcPr>
-            <w:tcW w:w="0" w:type="auto"/>
-          </w:tcPr>
-          <w:p>
-            <w:pPr>
-              <w:pStyle w:val="Compact"/>
-              <w:ind w:left="360"/>
-              <w:rPr>
-                <w:color w:val="0D0D0D" w:themeColor="text1" w:themeTint="F2"/>
-              </w:rPr>
-            </w:pPr>
-            <w:r>
-              <w:rPr>
-                <w:color w:val="0D0D0D" w:themeColor="text1" w:themeTint="F2"/>
-              </w:rPr>
-              <w:t>Blue</w:t>
-            </w:r>
-          </w:p>
-        </w:tc>
-        <w:tc>
-          <w:tcPr>
-            <w:tcW w:w="0" w:type="auto"/>
-          </w:tcPr>
-          <w:p>
-            <w:pPr>
-              <w:pStyle w:val="Compact"/>
-              <w:ind w:left="360"/>
-              <w:rPr>
-                <w:color w:val="0D0D0D" w:themeColor="text1" w:themeTint="F2"/>
-              </w:rPr>
-            </w:pPr>
-            <w:r>
-              <w:rPr>
-                <w:color w:val="0D0D0D" w:themeColor="text1" w:themeTint="F2"/>
-              </w:rPr>
-              <w:t>Navigation buttons</w:t>
-            </w:r>
-          </w:p>
-        </w:tc>
-      </w:tr>
-      <w:tr>
+        <w:trPr>
+          <w:trHeight w:val="302"/>
+        </w:trPr>
         <w:tc>
           <w:tcPr>
             <w:tcW w:w="0" w:type="auto"/>
@@ -1729,11 +1646,56 @@
               <w:rPr>
                 <w:color w:val="0D0D0D" w:themeColor="text1" w:themeTint="F2"/>
               </w:rPr>
-              <w:t>Background overlays and contrast</w:t>
+              <w:t xml:space="preserve">Default </w:t>
+            </w:r>
+            <w:r>
+              <w:rPr>
+                <w:color w:val="0D0D0D" w:themeColor="text1" w:themeTint="F2"/>
+              </w:rPr>
+              <w:t xml:space="preserve">Background </w:t>
+            </w:r>
+            <w:r>
+              <w:rPr>
+                <w:color w:val="0D0D0D" w:themeColor="text1" w:themeTint="F2"/>
+              </w:rPr>
+              <w:t>Color</w:t>
             </w:r>
           </w:p>
         </w:tc>
       </w:tr>
+      <w:tr>
+        <w:trPr>
+          <w:trHeight w:val="310"/>
+        </w:trPr>
+        <w:tc>
+          <w:tcPr>
+            <w:tcW w:w="0" w:type="auto"/>
+          </w:tcPr>
+          <w:p>
+            <w:pPr>
+              <w:pStyle w:val="Compact"/>
+              <w:ind w:left="360"/>
+              <w:rPr>
+                <w:color w:val="0D0D0D" w:themeColor="text1" w:themeTint="F2"/>
+              </w:rPr>
+            </w:pPr>
+          </w:p>
+        </w:tc>
+        <w:tc>
+          <w:tcPr>
+            <w:tcW w:w="0" w:type="auto"/>
+          </w:tcPr>
+          <w:p>
+            <w:pPr>
+              <w:pStyle w:val="Compact"/>
+              <w:ind w:left="360"/>
+              <w:rPr>
+                <w:color w:val="0D0D0D" w:themeColor="text1" w:themeTint="F2"/>
+              </w:rPr>
+            </w:pPr>
+          </w:p>
+        </w:tc>
+      </w:tr>
     </w:tbl>
     <w:p>
       <w:pPr>
@@ -1749,7 +1711,6 @@
         <w:rPr>
           <w:color w:val="0D0D0D" w:themeColor="text1" w:themeTint="F2"/>
         </w:rPr>
-        <w:lastRenderedPageBreak/>
         <w:t>Typography</w:t>
       </w:r>
     </w:p>
@@ -1782,22 +1743,22 @@
         <w:rPr>
           <w:color w:val="0D0D0D" w:themeColor="text1" w:themeTint="F2"/>
         </w:rPr>
-        <w:t>Poppins</w:t>
-      </w:r>
-    </w:p>
-    <w:p>
-      <w:pPr>
-        <w:pStyle w:val="Compact"/>
-        <w:ind w:left="360"/>
-        <w:rPr>
-          <w:color w:val="0D0D0D" w:themeColor="text1" w:themeTint="F2"/>
-        </w:rPr>
-      </w:pPr>
-      <w:r>
-        <w:rPr>
-          <w:color w:val="0D0D0D" w:themeColor="text1" w:themeTint="F2"/>
-        </w:rPr>
-        <w:t>Nunito Sans</w:t>
+        <w:t>Jersey 10</w:t>
+      </w:r>
+    </w:p>
+    <w:p>
+      <w:pPr>
+        <w:pStyle w:val="FirstParagraph"/>
+        <w:ind w:left="360"/>
+        <w:rPr>
+          <w:color w:val="0D0D0D" w:themeColor="text1" w:themeTint="F2"/>
+        </w:rPr>
+      </w:pPr>
+      <w:r>
+        <w:rPr>
+          <w:color w:val="0D0D0D" w:themeColor="text1" w:themeTint="F2"/>
+        </w:rPr>
+        <w:t>Trebuchet MS</w:t>
       </w:r>
     </w:p>
     <w:p>
@@ -2045,6 +2006,21 @@
           <w:color w:val="0D0D0D" w:themeColor="text1" w:themeTint="F2"/>
         </w:rPr>
         <w:t>Optimized layout for smaller screens</w:t>
+      </w:r>
+    </w:p>
+    <w:p>
+      <w:pPr>
+        <w:pStyle w:val="Compact"/>
+        <w:ind w:left="360"/>
+        <w:rPr>
+          <w:color w:val="0D0D0D" w:themeColor="text1" w:themeTint="F2"/>
+        </w:rPr>
+      </w:pPr>
+      <w:r>
+        <w:rPr>
+          <w:color w:val="0D0D0D" w:themeColor="text1" w:themeTint="F2"/>
+        </w:rPr>
+        <w:t>A reminder for portrait user to play at landscape</w:t>
       </w:r>
     </w:p>
     <w:p>
@@ -2079,13 +2055,7 @@
         <w:rPr>
           <w:color w:val="0D0D0D" w:themeColor="text1" w:themeTint="F2"/>
         </w:rPr>
-        <w:t>I</w:t>
-      </w:r>
-      <w:r>
-        <w:rPr>
-          <w:color w:val="0D0D0D" w:themeColor="text1" w:themeTint="F2"/>
-        </w:rPr>
-        <w:t>mplementation</w:t>
+        <w:t>Implementation</w:t>
       </w:r>
     </w:p>
     <w:p>
@@ -2106,133 +2076,260 @@
     </w:p>
     <w:p>
       <w:pPr>
-        <w:pStyle w:val="SourceCode"/>
-        <w:ind w:left="360"/>
-        <w:rPr>
-          <w:color w:val="0D0D0D" w:themeColor="text1" w:themeTint="F2"/>
-        </w:rPr>
-      </w:pPr>
-      <w:proofErr w:type="spellStart"/>
-      <w:r>
+        <w:ind w:left="360"/>
         <w:rPr>
           <w:rStyle w:val="VerbatimChar"/>
           <w:color w:val="0D0D0D" w:themeColor="text1" w:themeTint="F2"/>
         </w:rPr>
-        <w:t>Dere</w:t>
-      </w:r>
-      <w:proofErr w:type="spellEnd"/>
+      </w:pPr>
       <w:r>
         <w:rPr>
           <w:rStyle w:val="VerbatimChar"/>
           <w:color w:val="0D0D0D" w:themeColor="text1" w:themeTint="F2"/>
         </w:rPr>
-        <w:t xml:space="preserve">~ The </w:t>
-      </w:r>
-      <w:proofErr w:type="spellStart"/>
+        <w:t>DERE</w:t>
+      </w:r>
       <w:r>
         <w:rPr>
           <w:rStyle w:val="VerbatimChar"/>
           <w:color w:val="0D0D0D" w:themeColor="text1" w:themeTint="F2"/>
         </w:rPr>
-        <w:t>Dere</w:t>
-      </w:r>
-      <w:proofErr w:type="spellEnd"/>
+        <w:t>-</w:t>
+      </w:r>
       <w:r>
         <w:rPr>
           <w:rStyle w:val="VerbatimChar"/>
           <w:color w:val="0D0D0D" w:themeColor="text1" w:themeTint="F2"/>
         </w:rPr>
-        <w:t xml:space="preserve"> </w:t>
+        <w:t>T</w:t>
       </w:r>
       <w:r>
         <w:rPr>
           <w:rStyle w:val="VerbatimChar"/>
           <w:color w:val="0D0D0D" w:themeColor="text1" w:themeTint="F2"/>
         </w:rPr>
-        <w:t>Club/</w:t>
-      </w:r>
-      <w:r>
-        <w:rPr>
-          <w:color w:val="0D0D0D" w:themeColor="text1" w:themeTint="F2"/>
-        </w:rPr>
-        <w:br/>
-      </w:r>
-    </w:p>
-    <w:p>
-      <w:pPr>
-        <w:pStyle w:val="SourceCode"/>
-        <w:ind w:left="360"/>
+        <w:t>he-</w:t>
+      </w:r>
+      <w:r>
         <w:rPr>
           <w:rStyle w:val="VerbatimChar"/>
           <w:color w:val="0D0D0D" w:themeColor="text1" w:themeTint="F2"/>
         </w:rPr>
-      </w:pPr>
+        <w:t>D</w:t>
+      </w:r>
       <w:r>
         <w:rPr>
           <w:rStyle w:val="VerbatimChar"/>
           <w:color w:val="0D0D0D" w:themeColor="text1" w:themeTint="F2"/>
         </w:rPr>
-        <w:t>images/</w:t>
-      </w:r>
-    </w:p>
-    <w:p>
-      <w:pPr>
-        <w:pStyle w:val="SourceCode"/>
-        <w:ind w:left="360"/>
-        <w:rPr>
-          <w:rFonts w:ascii="Consolas" w:hAnsi="Consolas"/>
-          <w:color w:val="0D0D0D" w:themeColor="text1" w:themeTint="F2"/>
-          <w:sz w:val="22"/>
-        </w:rPr>
-      </w:pPr>
+        <w:t>ere-</w:t>
+      </w:r>
       <w:r>
         <w:rPr>
           <w:rStyle w:val="VerbatimChar"/>
           <w:color w:val="0D0D0D" w:themeColor="text1" w:themeTint="F2"/>
         </w:rPr>
-        <w:t>scripts/</w:t>
-      </w:r>
-      <w:r>
-        <w:rPr>
-          <w:color w:val="0D0D0D" w:themeColor="text1" w:themeTint="F2"/>
-        </w:rPr>
-        <w:br/>
+        <w:t>C</w:t>
       </w:r>
       <w:r>
         <w:rPr>
           <w:rStyle w:val="VerbatimChar"/>
           <w:color w:val="0D0D0D" w:themeColor="text1" w:themeTint="F2"/>
         </w:rPr>
-        <w:t>index.html</w:t>
-      </w:r>
-      <w:r>
-        <w:rPr>
-          <w:color w:val="0D0D0D" w:themeColor="text1" w:themeTint="F2"/>
-        </w:rPr>
-        <w:br/>
-      </w:r>
-      <w:r>
+        <w:t>lub-/</w:t>
+      </w:r>
+    </w:p>
+    <w:p>
+      <w:pPr>
+        <w:ind w:left="360"/>
         <w:rPr>
           <w:rStyle w:val="VerbatimChar"/>
           <w:color w:val="0D0D0D" w:themeColor="text1" w:themeTint="F2"/>
         </w:rPr>
-        <w:t>sty</w:t>
-      </w:r>
+      </w:pPr>
       <w:r>
         <w:rPr>
           <w:rStyle w:val="VerbatimChar"/>
           <w:color w:val="0D0D0D" w:themeColor="text1" w:themeTint="F2"/>
         </w:rPr>
-        <w:t>le.css</w:t>
-      </w:r>
-    </w:p>
-    <w:p>
-      <w:pPr>
-        <w:ind w:left="360"/>
-        <w:rPr>
-          <w:color w:val="0D0D0D" w:themeColor="text1" w:themeTint="F2"/>
-        </w:rPr>
-      </w:pPr>
+        <w:t xml:space="preserve">    ├── index.html</w:t>
+      </w:r>
+    </w:p>
+    <w:p>
+      <w:pPr>
+        <w:ind w:left="360"/>
+        <w:rPr>
+          <w:rStyle w:val="VerbatimChar"/>
+          <w:color w:val="0D0D0D" w:themeColor="text1" w:themeTint="F2"/>
+        </w:rPr>
+      </w:pPr>
+      <w:r>
+        <w:rPr>
+          <w:rStyle w:val="VerbatimChar"/>
+          <w:color w:val="0D0D0D" w:themeColor="text1" w:themeTint="F2"/>
+        </w:rPr>
+        <w:lastRenderedPageBreak/>
+        <w:t xml:space="preserve">    ├── style.css</w:t>
+      </w:r>
+    </w:p>
+    <w:p>
+      <w:pPr>
+        <w:ind w:left="360"/>
+        <w:rPr>
+          <w:rStyle w:val="VerbatimChar"/>
+          <w:color w:val="0D0D0D" w:themeColor="text1" w:themeTint="F2"/>
+        </w:rPr>
+      </w:pPr>
+      <w:r>
+        <w:rPr>
+          <w:rStyle w:val="VerbatimChar"/>
+          <w:color w:val="0D0D0D" w:themeColor="text1" w:themeTint="F2"/>
+        </w:rPr>
+        <w:t xml:space="preserve">    ├── data/</w:t>
+      </w:r>
+    </w:p>
+    <w:p>
+      <w:pPr>
+        <w:ind w:left="360"/>
+        <w:rPr>
+          <w:rStyle w:val="VerbatimChar"/>
+          <w:color w:val="0D0D0D" w:themeColor="text1" w:themeTint="F2"/>
+        </w:rPr>
+      </w:pPr>
+      <w:r>
+        <w:rPr>
+          <w:rStyle w:val="VerbatimChar"/>
+          <w:color w:val="0D0D0D" w:themeColor="text1" w:themeTint="F2"/>
+        </w:rPr>
+        <w:t xml:space="preserve">    │   ├── character_info.json</w:t>
+      </w:r>
+    </w:p>
+    <w:p>
+      <w:pPr>
+        <w:ind w:left="360"/>
+        <w:rPr>
+          <w:rStyle w:val="VerbatimChar"/>
+          <w:color w:val="0D0D0D" w:themeColor="text1" w:themeTint="F2"/>
+        </w:rPr>
+      </w:pPr>
+      <w:r>
+        <w:rPr>
+          <w:rStyle w:val="VerbatimChar"/>
+          <w:color w:val="0D0D0D" w:themeColor="text1" w:themeTint="F2"/>
+        </w:rPr>
+        <w:t xml:space="preserve">    │   └── year/</w:t>
+      </w:r>
+    </w:p>
+    <w:p>
+      <w:pPr>
+        <w:ind w:left="360"/>
+        <w:rPr>
+          <w:rStyle w:val="VerbatimChar"/>
+          <w:color w:val="0D0D0D" w:themeColor="text1" w:themeTint="F2"/>
+        </w:rPr>
+      </w:pPr>
+      <w:r>
+        <w:rPr>
+          <w:rStyle w:val="VerbatimChar"/>
+          <w:color w:val="0D0D0D" w:themeColor="text1" w:themeTint="F2"/>
+        </w:rPr>
+        <w:t xml:space="preserve">    │       └── year1.json</w:t>
+      </w:r>
+    </w:p>
+    <w:p>
+      <w:pPr>
+        <w:ind w:left="360"/>
+        <w:rPr>
+          <w:rStyle w:val="VerbatimChar"/>
+          <w:color w:val="0D0D0D" w:themeColor="text1" w:themeTint="F2"/>
+        </w:rPr>
+      </w:pPr>
+      <w:r>
+        <w:rPr>
+          <w:rStyle w:val="VerbatimChar"/>
+          <w:color w:val="0D0D0D" w:themeColor="text1" w:themeTint="F2"/>
+        </w:rPr>
+        <w:t xml:space="preserve">    ├── Documentation/</w:t>
+      </w:r>
+    </w:p>
+    <w:p>
+      <w:pPr>
+        <w:ind w:left="360"/>
+        <w:rPr>
+          <w:rStyle w:val="VerbatimChar"/>
+          <w:color w:val="0D0D0D" w:themeColor="text1" w:themeTint="F2"/>
+        </w:rPr>
+      </w:pPr>
+      <w:r>
+        <w:rPr>
+          <w:rStyle w:val="VerbatimChar"/>
+          <w:color w:val="0D0D0D" w:themeColor="text1" w:themeTint="F2"/>
+        </w:rPr>
+        <w:t xml:space="preserve">    │   ├── Dere Club Web Development Project.docx</w:t>
+      </w:r>
+    </w:p>
+    <w:p>
+      <w:pPr>
+        <w:ind w:left="360"/>
+        <w:rPr>
+          <w:rStyle w:val="VerbatimChar"/>
+          <w:color w:val="0D0D0D" w:themeColor="text1" w:themeTint="F2"/>
+        </w:rPr>
+      </w:pPr>
+      <w:r>
+        <w:rPr>
+          <w:rStyle w:val="VerbatimChar"/>
+          <w:color w:val="0D0D0D" w:themeColor="text1" w:themeTint="F2"/>
+        </w:rPr>
+        <w:t xml:space="preserve">    │   ├── Dere_Character_Sheets.docx</w:t>
+      </w:r>
+    </w:p>
+    <w:p>
+      <w:pPr>
+        <w:ind w:left="360"/>
+        <w:rPr>
+          <w:rStyle w:val="VerbatimChar"/>
+          <w:color w:val="0D0D0D" w:themeColor="text1" w:themeTint="F2"/>
+        </w:rPr>
+      </w:pPr>
+      <w:r>
+        <w:rPr>
+          <w:rStyle w:val="VerbatimChar"/>
+          <w:color w:val="0D0D0D" w:themeColor="text1" w:themeTint="F2"/>
+        </w:rPr>
+        <w:t xml:space="preserve">    │   └── Dere_Club_Stripped_Documentation.docx</w:t>
+      </w:r>
+    </w:p>
+    <w:p>
+      <w:pPr>
+        <w:ind w:left="360"/>
+        <w:rPr>
+          <w:rStyle w:val="VerbatimChar"/>
+          <w:color w:val="0D0D0D" w:themeColor="text1" w:themeTint="F2"/>
+        </w:rPr>
+      </w:pPr>
+      <w:r>
+        <w:rPr>
+          <w:rStyle w:val="VerbatimChar"/>
+          <w:color w:val="0D0D0D" w:themeColor="text1" w:themeTint="F2"/>
+        </w:rPr>
+        <w:t xml:space="preserve">    └── scripts/</w:t>
+      </w:r>
+    </w:p>
+    <w:p>
+      <w:pPr>
+        <w:ind w:left="360"/>
+        <w:rPr>
+          <w:color w:val="0D0D0D" w:themeColor="text1" w:themeTint="F2"/>
+        </w:rPr>
+      </w:pPr>
+      <w:r>
+        <w:rPr>
+          <w:rStyle w:val="VerbatimChar"/>
+          <w:color w:val="0D0D0D" w:themeColor="text1" w:themeTint="F2"/>
+        </w:rPr>
+        <w:t xml:space="preserve">        └── main.js</w:t>
+      </w:r>
     </w:p>
     <w:p>
       <w:pPr>
@@ -2250,28 +2347,237 @@
           <w:color w:val="0D0D0D" w:themeColor="text1" w:themeTint="F2"/>
         </w:rPr>
         <w:lastRenderedPageBreak/>
-        <w:t>S</w:t>
-      </w:r>
-      <w:r>
-        <w:rPr>
-          <w:color w:val="0D0D0D" w:themeColor="text1" w:themeTint="F2"/>
-        </w:rPr>
-        <w:t>creenshots</w:t>
-      </w:r>
-    </w:p>
-    <w:p>
-      <w:pPr>
-        <w:pStyle w:val="FirstParagraph"/>
-        <w:ind w:left="360"/>
-        <w:rPr>
-          <w:color w:val="0D0D0D" w:themeColor="text1" w:themeTint="F2"/>
-        </w:rPr>
-      </w:pPr>
-      <w:r>
-        <w:rPr>
-          <w:color w:val="0D0D0D" w:themeColor="text1" w:themeTint="F2"/>
-        </w:rPr>
-        <w:t>The documentation includes screenshots of:</w:t>
+        <w:t>Screenshots</w:t>
+      </w:r>
+    </w:p>
+    <w:p>
+      <w:pPr>
+        <w:ind w:left="360"/>
+        <w:rPr>
+          <w:color w:val="0D0D0D" w:themeColor="text1" w:themeTint="F2"/>
+        </w:rPr>
+      </w:pPr>
+      <w:r>
+        <w:rPr>
+          <w:noProof/>
+          <w:color w:val="0D0D0D" w:themeColor="text1" w:themeTint="F2"/>
+        </w:rPr>
+        <w:drawing>
+          <wp:inline distT="0" distB="0" distL="0" distR="0" wp14:anchorId="0E776C7B" wp14:editId="15822F9A">
+            <wp:extent cx="5943600" cy="3044825"/>
+            <wp:effectExtent l="0" t="0" r="0" b="0"/>
+            <wp:docPr id="1451146515" name="Picture 10"/>
+            <wp:cNvGraphicFramePr>
+              <a:graphicFrameLocks xmlns:a="http://schemas.openxmlformats.org/drawingml/2006/main" noChangeAspect="1"/>
+            </wp:cNvGraphicFramePr>
+            <a:graphic xmlns:a="http://schemas.openxmlformats.org/drawingml/2006/main">
+              <a:graphicData uri="http://schemas.openxmlformats.org/drawingml/2006/picture">
+                <pic:pic xmlns:pic="http://schemas.openxmlformats.org/drawingml/2006/picture">
+                  <pic:nvPicPr>
+                    <pic:cNvPr id="1451146515" name="Picture 1451146515"/>
+                    <pic:cNvPicPr/>
+                  </pic:nvPicPr>
+                  <pic:blipFill>
+                    <a:blip r:embed="rId11" cstate="print">
+                      <a:extLst>
+                        <a:ext uri="{28A0092B-C50C-407E-A947-70E740481C1C}">
+                          <a14:useLocalDpi xmlns:a14="http://schemas.microsoft.com/office/drawing/2010/main" val="0"/>
+                        </a:ext>
+                      </a:extLst>
+                    </a:blip>
+                    <a:stretch>
+                      <a:fillRect/>
+                    </a:stretch>
+                  </pic:blipFill>
+                  <pic:spPr>
+                    <a:xfrm>
+                      <a:off x="0" y="0"/>
+                      <a:ext cx="5943600" cy="3044825"/>
+                    </a:xfrm>
+                    <a:prstGeom prst="rect">
+                      <a:avLst/>
+                    </a:prstGeom>
+                  </pic:spPr>
+                </pic:pic>
+              </a:graphicData>
+            </a:graphic>
+          </wp:inline>
+        </w:drawing>
+      </w:r>
+      <w:r>
+        <w:rPr>
+          <w:noProof/>
+          <w:color w:val="0D0D0D" w:themeColor="text1" w:themeTint="F2"/>
+        </w:rPr>
+        <w:drawing>
+          <wp:inline distT="0" distB="0" distL="0" distR="0" wp14:anchorId="32F18139" wp14:editId="714C41B8">
+            <wp:extent cx="5943600" cy="3063240"/>
+            <wp:effectExtent l="0" t="0" r="0" b="0"/>
+            <wp:docPr id="2017854918" name="Picture 11"/>
+            <wp:cNvGraphicFramePr>
+              <a:graphicFrameLocks xmlns:a="http://schemas.openxmlformats.org/drawingml/2006/main" noChangeAspect="1"/>
+            </wp:cNvGraphicFramePr>
+            <a:graphic xmlns:a="http://schemas.openxmlformats.org/drawingml/2006/main">
+              <a:graphicData uri="http://schemas.openxmlformats.org/drawingml/2006/picture">
+                <pic:pic xmlns:pic="http://schemas.openxmlformats.org/drawingml/2006/picture">
+                  <pic:nvPicPr>
+                    <pic:cNvPr id="2017854918" name="Picture 2017854918"/>
+                    <pic:cNvPicPr/>
+                  </pic:nvPicPr>
+                  <pic:blipFill>
+                    <a:blip r:embed="rId12" cstate="print">
+                      <a:extLst>
+                        <a:ext uri="{28A0092B-C50C-407E-A947-70E740481C1C}">
+                          <a14:useLocalDpi xmlns:a14="http://schemas.microsoft.com/office/drawing/2010/main" val="0"/>
+                        </a:ext>
+                      </a:extLst>
+                    </a:blip>
+                    <a:stretch>
+                      <a:fillRect/>
+                    </a:stretch>
+                  </pic:blipFill>
+                  <pic:spPr>
+                    <a:xfrm>
+                      <a:off x="0" y="0"/>
+                      <a:ext cx="5943600" cy="3063240"/>
+                    </a:xfrm>
+                    <a:prstGeom prst="rect">
+                      <a:avLst/>
+                    </a:prstGeom>
+                  </pic:spPr>
+                </pic:pic>
+              </a:graphicData>
+            </a:graphic>
+          </wp:inline>
+        </w:drawing>
+      </w:r>
+      <w:r>
+        <w:rPr>
+          <w:noProof/>
+          <w:color w:val="0D0D0D" w:themeColor="text1" w:themeTint="F2"/>
+        </w:rPr>
+        <w:lastRenderedPageBreak/>
+        <w:drawing>
+          <wp:inline distT="0" distB="0" distL="0" distR="0" wp14:anchorId="5EEF089A" wp14:editId="00DE7572">
+            <wp:extent cx="5943600" cy="3043555"/>
+            <wp:effectExtent l="0" t="0" r="0" b="0"/>
+            <wp:docPr id="1991932746" name="Picture 12"/>
+            <wp:cNvGraphicFramePr>
+              <a:graphicFrameLocks xmlns:a="http://schemas.openxmlformats.org/drawingml/2006/main" noChangeAspect="1"/>
+            </wp:cNvGraphicFramePr>
+            <a:graphic xmlns:a="http://schemas.openxmlformats.org/drawingml/2006/main">
+              <a:graphicData uri="http://schemas.openxmlformats.org/drawingml/2006/picture">
+                <pic:pic xmlns:pic="http://schemas.openxmlformats.org/drawingml/2006/picture">
+                  <pic:nvPicPr>
+                    <pic:cNvPr id="1991932746" name="Picture 1991932746"/>
+                    <pic:cNvPicPr/>
+                  </pic:nvPicPr>
+                  <pic:blipFill>
+                    <a:blip r:embed="rId13" cstate="print">
+                      <a:extLst>
+                        <a:ext uri="{28A0092B-C50C-407E-A947-70E740481C1C}">
+                          <a14:useLocalDpi xmlns:a14="http://schemas.microsoft.com/office/drawing/2010/main" val="0"/>
+                        </a:ext>
+                      </a:extLst>
+                    </a:blip>
+                    <a:stretch>
+                      <a:fillRect/>
+                    </a:stretch>
+                  </pic:blipFill>
+                  <pic:spPr>
+                    <a:xfrm>
+                      <a:off x="0" y="0"/>
+                      <a:ext cx="5943600" cy="3043555"/>
+                    </a:xfrm>
+                    <a:prstGeom prst="rect">
+                      <a:avLst/>
+                    </a:prstGeom>
+                  </pic:spPr>
+                </pic:pic>
+              </a:graphicData>
+            </a:graphic>
+          </wp:inline>
+        </w:drawing>
+      </w:r>
+      <w:r>
+        <w:rPr>
+          <w:noProof/>
+          <w:color w:val="0D0D0D" w:themeColor="text1" w:themeTint="F2"/>
+        </w:rPr>
+        <w:drawing>
+          <wp:inline distT="0" distB="0" distL="0" distR="0" wp14:anchorId="31DE3B28" wp14:editId="1547DC63">
+            <wp:extent cx="5943600" cy="2992120"/>
+            <wp:effectExtent l="0" t="0" r="0" b="0"/>
+            <wp:docPr id="98175562" name="Picture 13"/>
+            <wp:cNvGraphicFramePr>
+              <a:graphicFrameLocks xmlns:a="http://schemas.openxmlformats.org/drawingml/2006/main" noChangeAspect="1"/>
+            </wp:cNvGraphicFramePr>
+            <a:graphic xmlns:a="http://schemas.openxmlformats.org/drawingml/2006/main">
+              <a:graphicData uri="http://schemas.openxmlformats.org/drawingml/2006/picture">
+                <pic:pic xmlns:pic="http://schemas.openxmlformats.org/drawingml/2006/picture">
+                  <pic:nvPicPr>
+                    <pic:cNvPr id="98175562" name="Picture 98175562"/>
+                    <pic:cNvPicPr/>
+                  </pic:nvPicPr>
+                  <pic:blipFill>
+                    <a:blip r:embed="rId14" cstate="print">
+                      <a:extLst>
+                        <a:ext uri="{28A0092B-C50C-407E-A947-70E740481C1C}">
+                          <a14:useLocalDpi xmlns:a14="http://schemas.microsoft.com/office/drawing/2010/main" val="0"/>
+                        </a:ext>
+                      </a:extLst>
+                    </a:blip>
+                    <a:stretch>
+                      <a:fillRect/>
+                    </a:stretch>
+                  </pic:blipFill>
+                  <pic:spPr>
+                    <a:xfrm>
+                      <a:off x="0" y="0"/>
+                      <a:ext cx="5943600" cy="2992120"/>
+                    </a:xfrm>
+                    <a:prstGeom prst="rect">
+                      <a:avLst/>
+                    </a:prstGeom>
+                  </pic:spPr>
+                </pic:pic>
+              </a:graphicData>
+            </a:graphic>
+          </wp:inline>
+        </w:drawing>
+      </w:r>
+    </w:p>
+    <w:p>
+      <w:pPr>
+        <w:ind w:left="360"/>
+        <w:rPr>
+          <w:color w:val="0D0D0D" w:themeColor="text1" w:themeTint="F2"/>
+        </w:rPr>
+      </w:pPr>
+      <w:r>
+        <w:rPr>
+          <w:color w:val="0D0D0D" w:themeColor="text1" w:themeTint="F2"/>
+        </w:rPr>
+        <w:pict w14:anchorId="24579774">
+          <v:rect id="_x0000_i1030" style="width:0;height:1.5pt" o:hralign="center" o:hrstd="t" o:hr="t"/>
+        </w:pict>
+      </w:r>
+    </w:p>
+    <w:p>
+      <w:pPr>
+        <w:pStyle w:val="Heading1"/>
+        <w:ind w:left="360"/>
+        <w:rPr>
+          <w:color w:val="0D0D0D" w:themeColor="text1" w:themeTint="F2"/>
+        </w:rPr>
+      </w:pPr>
+      <w:bookmarkStart w:id="23" w:name="challenges-encountered"/>
+      <w:bookmarkEnd w:id="22"/>
+      <w:r>
+        <w:rPr>
+          <w:color w:val="0D0D0D" w:themeColor="text1" w:themeTint="F2"/>
+        </w:rPr>
+        <w:t>Challenges Encountered</w:t>
       </w:r>
     </w:p>
     <w:p>
@@ -2286,7 +2592,7 @@
         <w:rPr>
           <w:color w:val="0D0D0D" w:themeColor="text1" w:themeTint="F2"/>
         </w:rPr>
-        <w:t>Home Page</w:t>
+        <w:t>Designing an interface that resembles a visual novel.</w:t>
       </w:r>
     </w:p>
     <w:p>
@@ -2301,7 +2607,7 @@
         <w:rPr>
           <w:color w:val="0D0D0D" w:themeColor="text1" w:themeTint="F2"/>
         </w:rPr>
-        <w:t>Story Interface</w:t>
+        <w:t>Managing large amounts of dialogue for multiple characters.</w:t>
       </w:r>
     </w:p>
     <w:p>
@@ -2316,7 +2622,7 @@
         <w:rPr>
           <w:color w:val="0D0D0D" w:themeColor="text1" w:themeTint="F2"/>
         </w:rPr>
-        <w:t>Character Dialogue Scene</w:t>
+        <w:t>Organizing JavaScript code for branching story paths.</w:t>
       </w:r>
     </w:p>
     <w:p>
@@ -2331,7 +2637,7 @@
         <w:rPr>
           <w:color w:val="0D0D0D" w:themeColor="text1" w:themeTint="F2"/>
         </w:rPr>
-        <w:t>Choice Selection</w:t>
+        <w:t>Making the website responsive across different screen sizes.</w:t>
       </w:r>
     </w:p>
     <w:p>
@@ -2346,36 +2652,21 @@
         <w:rPr>
           <w:color w:val="0D0D0D" w:themeColor="text1" w:themeTint="F2"/>
         </w:rPr>
-        <w:t>Character Profile</w:t>
-      </w:r>
-    </w:p>
-    <w:p>
-      <w:pPr>
-        <w:pStyle w:val="Compact"/>
-        <w:ind w:left="360"/>
-        <w:rPr>
-          <w:color w:val="0D0D0D" w:themeColor="text1" w:themeTint="F2"/>
-        </w:rPr>
-      </w:pPr>
-      <w:r>
-        <w:rPr>
-          <w:color w:val="0D0D0D" w:themeColor="text1" w:themeTint="F2"/>
-        </w:rPr>
-        <w:t>Mobile Version</w:t>
-      </w:r>
-    </w:p>
-    <w:p>
-      <w:pPr>
-        <w:ind w:left="360"/>
-        <w:rPr>
-          <w:color w:val="0D0D0D" w:themeColor="text1" w:themeTint="F2"/>
-        </w:rPr>
-      </w:pPr>
-      <w:r>
-        <w:rPr>
-          <w:color w:val="0D0D0D" w:themeColor="text1" w:themeTint="F2"/>
-        </w:rPr>
-        <w:pict w14:anchorId="24579774">
+        <w:t>Positioning character sprites consistently during conversations.</w:t>
+      </w:r>
+    </w:p>
+    <w:p>
+      <w:pPr>
+        <w:ind w:left="360"/>
+        <w:rPr>
+          <w:color w:val="0D0D0D" w:themeColor="text1" w:themeTint="F2"/>
+        </w:rPr>
+      </w:pPr>
+      <w:r>
+        <w:rPr>
+          <w:color w:val="0D0D0D" w:themeColor="text1" w:themeTint="F2"/>
+        </w:rPr>
+        <w:pict w14:anchorId="4F59FA22">
           <v:rect id="_x0000_i1031" style="width:0;height:1.5pt" o:hralign="center" o:hrstd="t" o:hr="t"/>
         </w:pict>
       </w:r>
@@ -2388,34 +2679,14 @@
           <w:color w:val="0D0D0D" w:themeColor="text1" w:themeTint="F2"/>
         </w:rPr>
       </w:pPr>
-      <w:bookmarkStart w:id="23" w:name="challenges-encountered"/>
-      <w:bookmarkEnd w:id="22"/>
-      <w:r>
-        <w:rPr>
-          <w:color w:val="0D0D0D" w:themeColor="text1" w:themeTint="F2"/>
-        </w:rPr>
-        <w:t>C</w:t>
-      </w:r>
-      <w:r>
-        <w:rPr>
-          <w:color w:val="0D0D0D" w:themeColor="text1" w:themeTint="F2"/>
-        </w:rPr>
-        <w:t>hallenges Encountered</w:t>
-      </w:r>
-    </w:p>
-    <w:p>
-      <w:pPr>
-        <w:pStyle w:val="FirstParagraph"/>
-        <w:ind w:left="360"/>
-        <w:rPr>
-          <w:color w:val="0D0D0D" w:themeColor="text1" w:themeTint="F2"/>
-        </w:rPr>
-      </w:pPr>
-      <w:r>
-        <w:rPr>
-          <w:color w:val="0D0D0D" w:themeColor="text1" w:themeTint="F2"/>
-        </w:rPr>
-        <w:t>Several challenges were encountered during development, including:</w:t>
+      <w:bookmarkStart w:id="24" w:name="solutions-applied"/>
+      <w:bookmarkEnd w:id="23"/>
+      <w:r>
+        <w:rPr>
+          <w:color w:val="0D0D0D" w:themeColor="text1" w:themeTint="F2"/>
+        </w:rPr>
+        <w:lastRenderedPageBreak/>
+        <w:t>Solutions Applied</w:t>
       </w:r>
     </w:p>
     <w:p>
@@ -2430,13 +2701,7 @@
         <w:rPr>
           <w:color w:val="0D0D0D" w:themeColor="text1" w:themeTint="F2"/>
         </w:rPr>
-        <w:t>Designing an inte</w:t>
-      </w:r>
-      <w:r>
-        <w:rPr>
-          <w:color w:val="0D0D0D" w:themeColor="text1" w:themeTint="F2"/>
-        </w:rPr>
-        <w:t>rface that resembles a visual novel.</w:t>
+        <w:t>Used CSS Flexbox and responsive layouts for different devices.</w:t>
       </w:r>
     </w:p>
     <w:p>
@@ -2451,7 +2716,7 @@
         <w:rPr>
           <w:color w:val="0D0D0D" w:themeColor="text1" w:themeTint="F2"/>
         </w:rPr>
-        <w:t>Managing large amounts of dialogue for multiple characters.</w:t>
+        <w:t>Organized dialogue into structured JavaScript objects.</w:t>
       </w:r>
     </w:p>
     <w:p>
@@ -2466,7 +2731,7 @@
         <w:rPr>
           <w:color w:val="0D0D0D" w:themeColor="text1" w:themeTint="F2"/>
         </w:rPr>
-        <w:t>Organizing JavaScript code for branching story paths.</w:t>
+        <w:t>Separated styling and scripting into different files for easier maintenance.</w:t>
       </w:r>
     </w:p>
     <w:p>
@@ -2481,7 +2746,7 @@
         <w:rPr>
           <w:color w:val="0D0D0D" w:themeColor="text1" w:themeTint="F2"/>
         </w:rPr>
-        <w:t>Making the website responsive across different screen sizes.</w:t>
+        <w:t>Tested the website on multiple screen sizes.</w:t>
       </w:r>
     </w:p>
     <w:p>
@@ -2496,27 +2761,21 @@
         <w:rPr>
           <w:color w:val="0D0D0D" w:themeColor="text1" w:themeTint="F2"/>
         </w:rPr>
-        <w:t>Positioning character sprites consistently d</w:t>
-      </w:r>
-      <w:r>
-        <w:rPr>
-          <w:color w:val="0D0D0D" w:themeColor="text1" w:themeTint="F2"/>
-        </w:rPr>
-        <w:t>uring conversations.</w:t>
-      </w:r>
-    </w:p>
-    <w:p>
-      <w:pPr>
-        <w:ind w:left="360"/>
-        <w:rPr>
-          <w:color w:val="0D0D0D" w:themeColor="text1" w:themeTint="F2"/>
-        </w:rPr>
-      </w:pPr>
-      <w:r>
-        <w:rPr>
-          <w:color w:val="0D0D0D" w:themeColor="text1" w:themeTint="F2"/>
-        </w:rPr>
-        <w:pict w14:anchorId="4F59FA22">
+        <w:t>Reused interface components to keep the design consistent.</w:t>
+      </w:r>
+    </w:p>
+    <w:p>
+      <w:pPr>
+        <w:ind w:left="360"/>
+        <w:rPr>
+          <w:color w:val="0D0D0D" w:themeColor="text1" w:themeTint="F2"/>
+        </w:rPr>
+      </w:pPr>
+      <w:r>
+        <w:rPr>
+          <w:color w:val="0D0D0D" w:themeColor="text1" w:themeTint="F2"/>
+        </w:rPr>
+        <w:pict w14:anchorId="49DDBEA5">
           <v:rect id="_x0000_i1032" style="width:0;height:1.5pt" o:hralign="center" o:hrstd="t" o:hr="t"/>
         </w:pict>
       </w:r>
@@ -2529,19 +2788,13 @@
           <w:color w:val="0D0D0D" w:themeColor="text1" w:themeTint="F2"/>
         </w:rPr>
       </w:pPr>
-      <w:bookmarkStart w:id="24" w:name="solutions-applied"/>
-      <w:bookmarkEnd w:id="23"/>
-      <w:r>
-        <w:rPr>
-          <w:color w:val="0D0D0D" w:themeColor="text1" w:themeTint="F2"/>
-        </w:rPr>
-        <w:t>S</w:t>
-      </w:r>
-      <w:r>
-        <w:rPr>
-          <w:color w:val="0D0D0D" w:themeColor="text1" w:themeTint="F2"/>
-        </w:rPr>
-        <w:t>olutions Applied</w:t>
+      <w:bookmarkStart w:id="25" w:name="conclusion"/>
+      <w:bookmarkEnd w:id="24"/>
+      <w:r>
+        <w:rPr>
+          <w:color w:val="0D0D0D" w:themeColor="text1" w:themeTint="F2"/>
+        </w:rPr>
+        <w:t>Conclusion</w:t>
       </w:r>
     </w:p>
     <w:p>
@@ -2556,96 +2809,50 @@
         <w:rPr>
           <w:color w:val="0D0D0D" w:themeColor="text1" w:themeTint="F2"/>
         </w:rPr>
-        <w:t>The following solutions were implemented:</w:t>
-      </w:r>
-    </w:p>
-    <w:p>
-      <w:pPr>
-        <w:pStyle w:val="Compact"/>
-        <w:ind w:left="360"/>
-        <w:rPr>
-          <w:color w:val="0D0D0D" w:themeColor="text1" w:themeTint="F2"/>
-        </w:rPr>
-      </w:pPr>
-      <w:r>
-        <w:rPr>
-          <w:color w:val="0D0D0D" w:themeColor="text1" w:themeTint="F2"/>
-        </w:rPr>
-        <w:t>Used CSS Flexbox and responsive layouts for different devices.</w:t>
-      </w:r>
-    </w:p>
-    <w:p>
-      <w:pPr>
-        <w:pStyle w:val="Compact"/>
-        <w:ind w:left="360"/>
-        <w:rPr>
-          <w:color w:val="0D0D0D" w:themeColor="text1" w:themeTint="F2"/>
-        </w:rPr>
-      </w:pPr>
-      <w:r>
-        <w:rPr>
-          <w:color w:val="0D0D0D" w:themeColor="text1" w:themeTint="F2"/>
-        </w:rPr>
-        <w:t>Organized dialogue into structured JavaScript objects.</w:t>
-      </w:r>
-    </w:p>
-    <w:p>
-      <w:pPr>
-        <w:pStyle w:val="Compact"/>
-        <w:ind w:left="360"/>
-        <w:rPr>
-          <w:color w:val="0D0D0D" w:themeColor="text1" w:themeTint="F2"/>
-        </w:rPr>
-      </w:pPr>
-      <w:r>
-        <w:rPr>
-          <w:color w:val="0D0D0D" w:themeColor="text1" w:themeTint="F2"/>
-        </w:rPr>
-        <w:t>Separated styling and scripting into different files for easier maintenance.</w:t>
-      </w:r>
-    </w:p>
-    <w:p>
-      <w:pPr>
-        <w:pStyle w:val="Compact"/>
-        <w:ind w:left="360"/>
-        <w:rPr>
-          <w:color w:val="0D0D0D" w:themeColor="text1" w:themeTint="F2"/>
-        </w:rPr>
-      </w:pPr>
-      <w:r>
-        <w:rPr>
-          <w:color w:val="0D0D0D" w:themeColor="text1" w:themeTint="F2"/>
-        </w:rPr>
-        <w:t>Tested the website on multiple screen sizes.</w:t>
-      </w:r>
-    </w:p>
-    <w:p>
-      <w:pPr>
-        <w:pStyle w:val="Compact"/>
-        <w:ind w:left="360"/>
-        <w:rPr>
-          <w:color w:val="0D0D0D" w:themeColor="text1" w:themeTint="F2"/>
-        </w:rPr>
-      </w:pPr>
-      <w:r>
-        <w:rPr>
-          <w:color w:val="0D0D0D" w:themeColor="text1" w:themeTint="F2"/>
-        </w:rPr>
-        <w:t>Reused interface components to keep the design consistent.</w:t>
-      </w:r>
-    </w:p>
-    <w:p>
-      <w:pPr>
-        <w:ind w:left="360"/>
-        <w:rPr>
-          <w:color w:val="0D0D0D" w:themeColor="text1" w:themeTint="F2"/>
-        </w:rPr>
-      </w:pPr>
-      <w:r>
-        <w:rPr>
-          <w:color w:val="0D0D0D" w:themeColor="text1" w:themeTint="F2"/>
-        </w:rPr>
-        <w:pict w14:anchorId="49DDBEA5">
+        <w:t xml:space="preserve">Developing </w:t>
+      </w:r>
+      <w:r>
+        <w:rPr>
+          <w:i/>
+          <w:iCs/>
+          <w:color w:val="0D0D0D" w:themeColor="text1" w:themeTint="F2"/>
+        </w:rPr>
+        <w:t>Dere Club</w:t>
+      </w:r>
+      <w:r>
+        <w:rPr>
+          <w:color w:val="0D0D0D" w:themeColor="text1" w:themeTint="F2"/>
+        </w:rPr>
+        <w:t xml:space="preserve"> provided valuable experience in both web development and interactive storytelling. The project demonstrated how HTML, CSS, and JavaScript can be combined to create a browser-based visual novel featuring branching dialogue and character interactions.</w:t>
+      </w:r>
+    </w:p>
+    <w:p>
+      <w:pPr>
+        <w:pStyle w:val="BodyText"/>
+        <w:ind w:left="360"/>
+        <w:rPr>
+          <w:color w:val="0D0D0D" w:themeColor="text1" w:themeTint="F2"/>
+        </w:rPr>
+      </w:pPr>
+      <w:r>
+        <w:rPr>
+          <w:color w:val="0D0D0D" w:themeColor="text1" w:themeTint="F2"/>
+        </w:rPr>
+        <w:t>Throughout the development process, skills in programming, responsive design, interface design, and project organization were strengthened. Future improvements may include additional story routes, more characters, an achievement system, animated character sprites, voice acting, and cloud-based save functionality.</w:t>
+      </w:r>
+    </w:p>
+    <w:p>
+      <w:pPr>
+        <w:ind w:left="360"/>
+        <w:rPr>
+          <w:color w:val="0D0D0D" w:themeColor="text1" w:themeTint="F2"/>
+        </w:rPr>
+      </w:pPr>
+      <w:r>
+        <w:rPr>
+          <w:color w:val="0D0D0D" w:themeColor="text1" w:themeTint="F2"/>
+        </w:rPr>
+        <w:pict w14:anchorId="5AE7A70B">
           <v:rect id="_x0000_i1033" style="width:0;height:1.5pt" o:hralign="center" o:hrstd="t" o:hr="t"/>
         </w:pict>
       </w:r>
@@ -2658,96 +2865,42 @@
           <w:color w:val="0D0D0D" w:themeColor="text1" w:themeTint="F2"/>
         </w:rPr>
       </w:pPr>
-      <w:bookmarkStart w:id="25" w:name="conclusion"/>
-      <w:bookmarkEnd w:id="24"/>
-      <w:r>
-        <w:rPr>
-          <w:color w:val="0D0D0D" w:themeColor="text1" w:themeTint="F2"/>
-        </w:rPr>
-        <w:t>C</w:t>
-      </w:r>
-      <w:r>
-        <w:rPr>
-          <w:color w:val="0D0D0D" w:themeColor="text1" w:themeTint="F2"/>
-        </w:rPr>
-        <w:t>onclusion</w:t>
-      </w:r>
-    </w:p>
-    <w:p>
-      <w:pPr>
-        <w:pStyle w:val="FirstParagraph"/>
-        <w:ind w:left="360"/>
-        <w:rPr>
-          <w:color w:val="0D0D0D" w:themeColor="text1" w:themeTint="F2"/>
-        </w:rPr>
-      </w:pPr>
-      <w:r>
-        <w:rPr>
-          <w:color w:val="0D0D0D" w:themeColor="text1" w:themeTint="F2"/>
-        </w:rPr>
-        <w:t>Dev</w:t>
-      </w:r>
-      <w:r>
-        <w:rPr>
-          <w:color w:val="0D0D0D" w:themeColor="text1" w:themeTint="F2"/>
-        </w:rPr>
-        <w:t xml:space="preserve">eloping </w:t>
-      </w:r>
-      <w:r>
-        <w:rPr>
-          <w:i/>
-          <w:iCs/>
-          <w:color w:val="0D0D0D" w:themeColor="text1" w:themeTint="F2"/>
-        </w:rPr>
-        <w:t>Dere Club</w:t>
-      </w:r>
-      <w:r>
-        <w:rPr>
-          <w:color w:val="0D0D0D" w:themeColor="text1" w:themeTint="F2"/>
-        </w:rPr>
-        <w:t xml:space="preserve"> provided valuable experience in both web development and interactive storytelling. The project demonstrated how HTML, CSS, and JavaScript can be combined to create a browser-based visual novel featuring branching dialogue and character in</w:t>
-      </w:r>
-      <w:r>
-        <w:rPr>
-          <w:color w:val="0D0D0D" w:themeColor="text1" w:themeTint="F2"/>
-        </w:rPr>
-        <w:t>teractions.</w:t>
-      </w:r>
-    </w:p>
-    <w:p>
-      <w:pPr>
-        <w:pStyle w:val="BodyText"/>
-        <w:ind w:left="360"/>
-        <w:rPr>
-          <w:color w:val="0D0D0D" w:themeColor="text1" w:themeTint="F2"/>
-        </w:rPr>
-      </w:pPr>
-      <w:r>
-        <w:rPr>
-          <w:color w:val="0D0D0D" w:themeColor="text1" w:themeTint="F2"/>
-        </w:rPr>
-        <w:lastRenderedPageBreak/>
-        <w:t>Throughout the development process, skills in programming, responsive design, interface design, and project organization were strengthened. Future improvements may include additional story routes, more characters, an achievement system, animate</w:t>
-      </w:r>
-      <w:r>
-        <w:rPr>
-          <w:color w:val="0D0D0D" w:themeColor="text1" w:themeTint="F2"/>
-        </w:rPr>
-        <w:t>d character sprites, voice acting, and cloud-based save functionality.</w:t>
-      </w:r>
-    </w:p>
-    <w:p>
-      <w:pPr>
-        <w:ind w:left="360"/>
-        <w:rPr>
-          <w:color w:val="0D0D0D" w:themeColor="text1" w:themeTint="F2"/>
-        </w:rPr>
-      </w:pPr>
-      <w:r>
-        <w:rPr>
-          <w:color w:val="0D0D0D" w:themeColor="text1" w:themeTint="F2"/>
-        </w:rPr>
-        <w:pict w14:anchorId="5AE7A70B">
+      <w:bookmarkStart w:id="26" w:name="references"/>
+      <w:bookmarkEnd w:id="25"/>
+      <w:r>
+        <w:rPr>
+          <w:color w:val="0D0D0D" w:themeColor="text1" w:themeTint="F2"/>
+        </w:rPr>
+        <w:t>References</w:t>
+      </w:r>
+    </w:p>
+    <w:p>
+      <w:pPr>
+        <w:pStyle w:val="Compact"/>
+        <w:ind w:left="360"/>
+        <w:rPr>
+          <w:color w:val="0D0D0D" w:themeColor="text1" w:themeTint="F2"/>
+        </w:rPr>
+      </w:pPr>
+      <w:r>
+        <w:rPr>
+          <w:color w:val="0D0D0D" w:themeColor="text1" w:themeTint="F2"/>
+        </w:rPr>
+        <w:t>Google Fonts</w:t>
+      </w:r>
+    </w:p>
+    <w:p>
+      <w:pPr>
+        <w:ind w:left="360"/>
+        <w:rPr>
+          <w:color w:val="0D0D0D" w:themeColor="text1" w:themeTint="F2"/>
+        </w:rPr>
+      </w:pPr>
+      <w:r>
+        <w:rPr>
+          <w:color w:val="0D0D0D" w:themeColor="text1" w:themeTint="F2"/>
+        </w:rPr>
+        <w:pict w14:anchorId="04002871">
           <v:rect id="_x0000_i1034" style="width:0;height:1.5pt" o:hralign="center" o:hrstd="t" o:hr="t"/>
         </w:pict>
       </w:r>
@@ -2760,166 +2913,17 @@
           <w:color w:val="0D0D0D" w:themeColor="text1" w:themeTint="F2"/>
         </w:rPr>
       </w:pPr>
-      <w:bookmarkStart w:id="26" w:name="references"/>
-      <w:bookmarkEnd w:id="25"/>
-      <w:r>
-        <w:rPr>
-          <w:color w:val="0D0D0D" w:themeColor="text1" w:themeTint="F2"/>
-        </w:rPr>
-        <w:t>R</w:t>
-      </w:r>
-      <w:r>
-        <w:rPr>
-          <w:color w:val="0D0D0D" w:themeColor="text1" w:themeTint="F2"/>
-        </w:rPr>
-        <w:t>eferences</w:t>
-      </w:r>
-    </w:p>
-    <w:p>
-      <w:pPr>
-        <w:pStyle w:val="Compact"/>
-        <w:ind w:left="360"/>
-        <w:rPr>
-          <w:color w:val="0D0D0D" w:themeColor="text1" w:themeTint="F2"/>
-        </w:rPr>
-      </w:pPr>
-      <w:r>
-        <w:rPr>
-          <w:color w:val="0D0D0D" w:themeColor="text1" w:themeTint="F2"/>
-        </w:rPr>
-        <w:t>W3Schools</w:t>
-      </w:r>
-    </w:p>
-    <w:p>
-      <w:pPr>
-        <w:pStyle w:val="Compact"/>
-        <w:ind w:left="360"/>
-        <w:rPr>
-          <w:color w:val="0D0D0D" w:themeColor="text1" w:themeTint="F2"/>
-        </w:rPr>
-      </w:pPr>
-      <w:r>
-        <w:rPr>
-          <w:color w:val="0D0D0D" w:themeColor="text1" w:themeTint="F2"/>
-        </w:rPr>
-        <w:t>MDN Web Docs</w:t>
-      </w:r>
-    </w:p>
-    <w:p>
-      <w:pPr>
-        <w:pStyle w:val="Compact"/>
-        <w:ind w:left="360"/>
-        <w:rPr>
-          <w:color w:val="0D0D0D" w:themeColor="text1" w:themeTint="F2"/>
-        </w:rPr>
-      </w:pPr>
-      <w:r>
-        <w:rPr>
-          <w:color w:val="0D0D0D" w:themeColor="text1" w:themeTint="F2"/>
-        </w:rPr>
-        <w:t>Google Fonts</w:t>
-      </w:r>
-    </w:p>
-    <w:p>
-      <w:pPr>
-        <w:pStyle w:val="Compact"/>
-        <w:ind w:left="360"/>
-        <w:rPr>
-          <w:color w:val="0D0D0D" w:themeColor="text1" w:themeTint="F2"/>
-        </w:rPr>
-      </w:pPr>
-      <w:r>
-        <w:rPr>
-          <w:color w:val="0D0D0D" w:themeColor="text1" w:themeTint="F2"/>
-        </w:rPr>
-        <w:t xml:space="preserve">Font Awesome </w:t>
-      </w:r>
-      <w:r>
-        <w:rPr>
-          <w:i/>
-          <w:iCs/>
-          <w:color w:val="0D0D0D" w:themeColor="text1" w:themeTint="F2"/>
-        </w:rPr>
-        <w:t>(if used)</w:t>
-      </w:r>
-    </w:p>
-    <w:p>
-      <w:pPr>
-        <w:pStyle w:val="Compact"/>
-        <w:ind w:left="360"/>
-        <w:rPr>
-          <w:color w:val="0D0D0D" w:themeColor="text1" w:themeTint="F2"/>
-        </w:rPr>
-      </w:pPr>
-      <w:r>
-        <w:rPr>
-          <w:color w:val="0D0D0D" w:themeColor="text1" w:themeTint="F2"/>
-        </w:rPr>
-        <w:t xml:space="preserve">ChatGPT </w:t>
-      </w:r>
-      <w:r>
-        <w:rPr>
-          <w:i/>
-          <w:iCs/>
-          <w:color w:val="0D0D0D" w:themeColor="text1" w:themeTint="F2"/>
-        </w:rPr>
-        <w:t>(for brainstorming and technical assistance, if permitted by the instructor)</w:t>
-      </w:r>
-    </w:p>
-    <w:p>
-      <w:pPr>
-        <w:ind w:left="360"/>
-        <w:rPr>
-          <w:color w:val="0D0D0D" w:themeColor="text1" w:themeTint="F2"/>
-        </w:rPr>
-      </w:pPr>
-      <w:r>
-        <w:rPr>
-          <w:color w:val="0D0D0D" w:themeColor="text1" w:themeTint="F2"/>
-        </w:rPr>
-        <w:pict w14:anchorId="04002871">
-          <v:rect id="_x0000_i1035" style="width:0;height:1.5pt" o:hralign="center" o:hrstd="t" o:hr="t"/>
-        </w:pict>
-      </w:r>
-    </w:p>
-    <w:p>
-      <w:pPr>
-        <w:pStyle w:val="Heading1"/>
-        <w:ind w:left="360"/>
-        <w:rPr>
-          <w:color w:val="0D0D0D" w:themeColor="text1" w:themeTint="F2"/>
-        </w:rPr>
-      </w:pPr>
       <w:bookmarkStart w:id="27" w:name="appendix"/>
       <w:bookmarkEnd w:id="26"/>
       <w:r>
         <w:rPr>
           <w:color w:val="0D0D0D" w:themeColor="text1" w:themeTint="F2"/>
         </w:rPr>
-        <w:t>A</w:t>
-      </w:r>
-      <w:r>
-        <w:rPr>
-          <w:color w:val="0D0D0D" w:themeColor="text1" w:themeTint="F2"/>
-        </w:rPr>
-        <w:t>ppendix</w:t>
-      </w:r>
-    </w:p>
-    <w:p>
-      <w:pPr>
-        <w:pStyle w:val="FirstParagraph"/>
-        <w:ind w:left="360"/>
-        <w:rPr>
-          <w:color w:val="0D0D0D" w:themeColor="text1" w:themeTint="F2"/>
-        </w:rPr>
-      </w:pPr>
-      <w:r>
-        <w:rPr>
-          <w:color w:val="0D0D0D" w:themeColor="text1" w:themeTint="F2"/>
-        </w:rPr>
-        <w:t>The appendix may include:</w:t>
-      </w:r>
-    </w:p>
+        <w:lastRenderedPageBreak/>
+        <w:t>Appendix</w:t>
+      </w:r>
+    </w:p>
+    <w:bookmarkEnd w:id="27"/>
     <w:p>
       <w:pPr>
         <w:pStyle w:val="Compact"/>
@@ -2930,86 +2934,384 @@
       </w:pPr>
       <w:r>
         <w:rPr>
-          <w:color w:val="0D0D0D" w:themeColor="text1" w:themeTint="F2"/>
-        </w:rPr>
-        <w:t>Source code samples</w:t>
-      </w:r>
-    </w:p>
-    <w:p>
-      <w:pPr>
-        <w:pStyle w:val="Compact"/>
-        <w:ind w:left="360"/>
-        <w:rPr>
-          <w:color w:val="0D0D0D" w:themeColor="text1" w:themeTint="F2"/>
-        </w:rPr>
-      </w:pPr>
-      <w:r>
-        <w:rPr>
-          <w:color w:val="0D0D0D" w:themeColor="text1" w:themeTint="F2"/>
-        </w:rPr>
-        <w:t>Character profile sheets</w:t>
-      </w:r>
-    </w:p>
-    <w:p>
-      <w:pPr>
-        <w:pStyle w:val="Compact"/>
-        <w:ind w:left="360"/>
-        <w:rPr>
-          <w:color w:val="0D0D0D" w:themeColor="text1" w:themeTint="F2"/>
-        </w:rPr>
-      </w:pPr>
-      <w:r>
-        <w:rPr>
-          <w:color w:val="0D0D0D" w:themeColor="text1" w:themeTint="F2"/>
-        </w:rPr>
-        <w:t>Dialogue flowcharts</w:t>
-      </w:r>
-    </w:p>
-    <w:p>
-      <w:pPr>
-        <w:pStyle w:val="Compact"/>
-        <w:ind w:left="360"/>
-        <w:rPr>
-          <w:color w:val="0D0D0D" w:themeColor="text1" w:themeTint="F2"/>
-        </w:rPr>
-      </w:pPr>
-      <w:r>
-        <w:rPr>
-          <w:color w:val="0D0D0D" w:themeColor="text1" w:themeTint="F2"/>
-        </w:rPr>
-        <w:t>Wireframe sketches</w:t>
-      </w:r>
-    </w:p>
-    <w:p>
-      <w:pPr>
-        <w:pStyle w:val="Compact"/>
-        <w:ind w:left="360"/>
-        <w:rPr>
-          <w:color w:val="0D0D0D" w:themeColor="text1" w:themeTint="F2"/>
-        </w:rPr>
-      </w:pPr>
-      <w:r>
-        <w:rPr>
-          <w:color w:val="0D0D0D" w:themeColor="text1" w:themeTint="F2"/>
-        </w:rPr>
-        <w:t>Additional screenshots</w:t>
-      </w:r>
-    </w:p>
-    <w:p>
-      <w:pPr>
-        <w:pStyle w:val="Compact"/>
-        <w:ind w:left="360"/>
-        <w:rPr>
-          <w:color w:val="0D0D0D" w:themeColor="text1" w:themeTint="F2"/>
-        </w:rPr>
-      </w:pPr>
-      <w:r>
-        <w:rPr>
-          <w:color w:val="0D0D0D" w:themeColor="text1" w:themeTint="F2"/>
-        </w:rPr>
-        <w:t>Testing checklist</w:t>
-      </w:r>
-      <w:bookmarkEnd w:id="27"/>
+          <w:noProof/>
+          <w:color w:val="0D0D0D" w:themeColor="text1" w:themeTint="F2"/>
+        </w:rPr>
+        <w:drawing>
+          <wp:inline distT="0" distB="0" distL="0" distR="0" wp14:anchorId="06900D3D" wp14:editId="7AD8D552">
+            <wp:extent cx="5943600" cy="3343275"/>
+            <wp:effectExtent l="0" t="0" r="0" b="0"/>
+            <wp:docPr id="179295945" name="Picture 1"/>
+            <wp:cNvGraphicFramePr>
+              <a:graphicFrameLocks xmlns:a="http://schemas.openxmlformats.org/drawingml/2006/main" noChangeAspect="1"/>
+            </wp:cNvGraphicFramePr>
+            <a:graphic xmlns:a="http://schemas.openxmlformats.org/drawingml/2006/main">
+              <a:graphicData uri="http://schemas.openxmlformats.org/drawingml/2006/picture">
+                <pic:pic xmlns:pic="http://schemas.openxmlformats.org/drawingml/2006/picture">
+                  <pic:nvPicPr>
+                    <pic:cNvPr id="179295945" name="Picture 179295945"/>
+                    <pic:cNvPicPr/>
+                  </pic:nvPicPr>
+                  <pic:blipFill>
+                    <a:blip r:embed="rId6">
+                      <a:extLst>
+                        <a:ext uri="{28A0092B-C50C-407E-A947-70E740481C1C}">
+                          <a14:useLocalDpi xmlns:a14="http://schemas.microsoft.com/office/drawing/2010/main" val="0"/>
+                        </a:ext>
+                      </a:extLst>
+                    </a:blip>
+                    <a:stretch>
+                      <a:fillRect/>
+                    </a:stretch>
+                  </pic:blipFill>
+                  <pic:spPr>
+                    <a:xfrm>
+                      <a:off x="0" y="0"/>
+                      <a:ext cx="5943600" cy="3343275"/>
+                    </a:xfrm>
+                    <a:prstGeom prst="rect">
+                      <a:avLst/>
+                    </a:prstGeom>
+                  </pic:spPr>
+                </pic:pic>
+              </a:graphicData>
+            </a:graphic>
+          </wp:inline>
+        </w:drawing>
+      </w:r>
+      <w:r>
+        <w:rPr>
+          <w:noProof/>
+          <w:color w:val="0D0D0D" w:themeColor="text1" w:themeTint="F2"/>
+        </w:rPr>
+        <w:drawing>
+          <wp:inline distT="0" distB="0" distL="0" distR="0" wp14:anchorId="1A03DC94" wp14:editId="6B7CAB70">
+            <wp:extent cx="5943600" cy="3343275"/>
+            <wp:effectExtent l="0" t="0" r="0" b="0"/>
+            <wp:docPr id="835510311" name="Picture 2"/>
+            <wp:cNvGraphicFramePr>
+              <a:graphicFrameLocks xmlns:a="http://schemas.openxmlformats.org/drawingml/2006/main" noChangeAspect="1"/>
+            </wp:cNvGraphicFramePr>
+            <a:graphic xmlns:a="http://schemas.openxmlformats.org/drawingml/2006/main">
+              <a:graphicData uri="http://schemas.openxmlformats.org/drawingml/2006/picture">
+                <pic:pic xmlns:pic="http://schemas.openxmlformats.org/drawingml/2006/picture">
+                  <pic:nvPicPr>
+                    <pic:cNvPr id="835510311" name="Picture 835510311"/>
+                    <pic:cNvPicPr/>
+                  </pic:nvPicPr>
+                  <pic:blipFill>
+                    <a:blip r:embed="rId7">
+                      <a:extLst>
+                        <a:ext uri="{28A0092B-C50C-407E-A947-70E740481C1C}">
+                          <a14:useLocalDpi xmlns:a14="http://schemas.microsoft.com/office/drawing/2010/main" val="0"/>
+                        </a:ext>
+                      </a:extLst>
+                    </a:blip>
+                    <a:stretch>
+                      <a:fillRect/>
+                    </a:stretch>
+                  </pic:blipFill>
+                  <pic:spPr>
+                    <a:xfrm>
+                      <a:off x="0" y="0"/>
+                      <a:ext cx="5943600" cy="3343275"/>
+                    </a:xfrm>
+                    <a:prstGeom prst="rect">
+                      <a:avLst/>
+                    </a:prstGeom>
+                  </pic:spPr>
+                </pic:pic>
+              </a:graphicData>
+            </a:graphic>
+          </wp:inline>
+        </w:drawing>
+      </w:r>
+      <w:r>
+        <w:rPr>
+          <w:noProof/>
+          <w:color w:val="0D0D0D" w:themeColor="text1" w:themeTint="F2"/>
+        </w:rPr>
+        <w:lastRenderedPageBreak/>
+        <w:drawing>
+          <wp:inline distT="0" distB="0" distL="0" distR="0" wp14:anchorId="7F5530DE" wp14:editId="0F820047">
+            <wp:extent cx="5943600" cy="3343275"/>
+            <wp:effectExtent l="0" t="0" r="0" b="0"/>
+            <wp:docPr id="822508874" name="Picture 4"/>
+            <wp:cNvGraphicFramePr>
+              <a:graphicFrameLocks xmlns:a="http://schemas.openxmlformats.org/drawingml/2006/main" noChangeAspect="1"/>
+            </wp:cNvGraphicFramePr>
+            <a:graphic xmlns:a="http://schemas.openxmlformats.org/drawingml/2006/main">
+              <a:graphicData uri="http://schemas.openxmlformats.org/drawingml/2006/picture">
+                <pic:pic xmlns:pic="http://schemas.openxmlformats.org/drawingml/2006/picture">
+                  <pic:nvPicPr>
+                    <pic:cNvPr id="822508874" name="Picture 822508874"/>
+                    <pic:cNvPicPr/>
+                  </pic:nvPicPr>
+                  <pic:blipFill>
+                    <a:blip r:embed="rId8">
+                      <a:extLst>
+                        <a:ext uri="{28A0092B-C50C-407E-A947-70E740481C1C}">
+                          <a14:useLocalDpi xmlns:a14="http://schemas.microsoft.com/office/drawing/2010/main" val="0"/>
+                        </a:ext>
+                      </a:extLst>
+                    </a:blip>
+                    <a:stretch>
+                      <a:fillRect/>
+                    </a:stretch>
+                  </pic:blipFill>
+                  <pic:spPr>
+                    <a:xfrm>
+                      <a:off x="0" y="0"/>
+                      <a:ext cx="5943600" cy="3343275"/>
+                    </a:xfrm>
+                    <a:prstGeom prst="rect">
+                      <a:avLst/>
+                    </a:prstGeom>
+                  </pic:spPr>
+                </pic:pic>
+              </a:graphicData>
+            </a:graphic>
+          </wp:inline>
+        </w:drawing>
+      </w:r>
+      <w:r>
+        <w:rPr>
+          <w:noProof/>
+          <w:color w:val="0D0D0D" w:themeColor="text1" w:themeTint="F2"/>
+        </w:rPr>
+        <w:drawing>
+          <wp:inline distT="0" distB="0" distL="0" distR="0" wp14:anchorId="3646AB6E" wp14:editId="2EA02D8A">
+            <wp:extent cx="5943600" cy="3343275"/>
+            <wp:effectExtent l="0" t="0" r="0" b="0"/>
+            <wp:docPr id="787859642" name="Picture 5"/>
+            <wp:cNvGraphicFramePr>
+              <a:graphicFrameLocks xmlns:a="http://schemas.openxmlformats.org/drawingml/2006/main" noChangeAspect="1"/>
+            </wp:cNvGraphicFramePr>
+            <a:graphic xmlns:a="http://schemas.openxmlformats.org/drawingml/2006/main">
+              <a:graphicData uri="http://schemas.openxmlformats.org/drawingml/2006/picture">
+                <pic:pic xmlns:pic="http://schemas.openxmlformats.org/drawingml/2006/picture">
+                  <pic:nvPicPr>
+                    <pic:cNvPr id="787859642" name="Picture 787859642"/>
+                    <pic:cNvPicPr/>
+                  </pic:nvPicPr>
+                  <pic:blipFill>
+                    <a:blip r:embed="rId15">
+                      <a:extLst>
+                        <a:ext uri="{28A0092B-C50C-407E-A947-70E740481C1C}">
+                          <a14:useLocalDpi xmlns:a14="http://schemas.microsoft.com/office/drawing/2010/main" val="0"/>
+                        </a:ext>
+                      </a:extLst>
+                    </a:blip>
+                    <a:stretch>
+                      <a:fillRect/>
+                    </a:stretch>
+                  </pic:blipFill>
+                  <pic:spPr>
+                    <a:xfrm>
+                      <a:off x="0" y="0"/>
+                      <a:ext cx="5943600" cy="3343275"/>
+                    </a:xfrm>
+                    <a:prstGeom prst="rect">
+                      <a:avLst/>
+                    </a:prstGeom>
+                  </pic:spPr>
+                </pic:pic>
+              </a:graphicData>
+            </a:graphic>
+          </wp:inline>
+        </w:drawing>
+      </w:r>
+      <w:r>
+        <w:rPr>
+          <w:noProof/>
+          <w:color w:val="0D0D0D" w:themeColor="text1" w:themeTint="F2"/>
+        </w:rPr>
+        <w:lastRenderedPageBreak/>
+        <w:drawing>
+          <wp:inline distT="0" distB="0" distL="0" distR="0" wp14:anchorId="2A847BF9" wp14:editId="0D568FB3">
+            <wp:extent cx="5943600" cy="7552690"/>
+            <wp:effectExtent l="0" t="0" r="0" b="0"/>
+            <wp:docPr id="1270818520" name="Picture 6"/>
+            <wp:cNvGraphicFramePr>
+              <a:graphicFrameLocks xmlns:a="http://schemas.openxmlformats.org/drawingml/2006/main" noChangeAspect="1"/>
+            </wp:cNvGraphicFramePr>
+            <a:graphic xmlns:a="http://schemas.openxmlformats.org/drawingml/2006/main">
+              <a:graphicData uri="http://schemas.openxmlformats.org/drawingml/2006/picture">
+                <pic:pic xmlns:pic="http://schemas.openxmlformats.org/drawingml/2006/picture">
+                  <pic:nvPicPr>
+                    <pic:cNvPr id="1270818520" name="Picture 1270818520"/>
+                    <pic:cNvPicPr/>
+                  </pic:nvPicPr>
+                  <pic:blipFill>
+                    <a:blip r:embed="rId16" cstate="print">
+                      <a:extLst>
+                        <a:ext uri="{28A0092B-C50C-407E-A947-70E740481C1C}">
+                          <a14:useLocalDpi xmlns:a14="http://schemas.microsoft.com/office/drawing/2010/main" val="0"/>
+                        </a:ext>
+                      </a:extLst>
+                    </a:blip>
+                    <a:stretch>
+                      <a:fillRect/>
+                    </a:stretch>
+                  </pic:blipFill>
+                  <pic:spPr>
+                    <a:xfrm>
+                      <a:off x="0" y="0"/>
+                      <a:ext cx="5943600" cy="7552690"/>
+                    </a:xfrm>
+                    <a:prstGeom prst="rect">
+                      <a:avLst/>
+                    </a:prstGeom>
+                  </pic:spPr>
+                </pic:pic>
+              </a:graphicData>
+            </a:graphic>
+          </wp:inline>
+        </w:drawing>
+      </w:r>
+      <w:r>
+        <w:rPr>
+          <w:noProof/>
+          <w:color w:val="0D0D0D" w:themeColor="text1" w:themeTint="F2"/>
+        </w:rPr>
+        <w:lastRenderedPageBreak/>
+        <w:drawing>
+          <wp:inline distT="0" distB="0" distL="0" distR="0" wp14:anchorId="4AF7C0F2" wp14:editId="604F8329">
+            <wp:extent cx="5943600" cy="3343275"/>
+            <wp:effectExtent l="0" t="0" r="0" b="0"/>
+            <wp:docPr id="1447883498" name="Picture 7"/>
+            <wp:cNvGraphicFramePr>
+              <a:graphicFrameLocks xmlns:a="http://schemas.openxmlformats.org/drawingml/2006/main" noChangeAspect="1"/>
+            </wp:cNvGraphicFramePr>
+            <a:graphic xmlns:a="http://schemas.openxmlformats.org/drawingml/2006/main">
+              <a:graphicData uri="http://schemas.openxmlformats.org/drawingml/2006/picture">
+                <pic:pic xmlns:pic="http://schemas.openxmlformats.org/drawingml/2006/picture">
+                  <pic:nvPicPr>
+                    <pic:cNvPr id="1447883498" name="Picture 1447883498"/>
+                    <pic:cNvPicPr/>
+                  </pic:nvPicPr>
+                  <pic:blipFill>
+                    <a:blip r:embed="rId9">
+                      <a:extLst>
+                        <a:ext uri="{28A0092B-C50C-407E-A947-70E740481C1C}">
+                          <a14:useLocalDpi xmlns:a14="http://schemas.microsoft.com/office/drawing/2010/main" val="0"/>
+                        </a:ext>
+                      </a:extLst>
+                    </a:blip>
+                    <a:stretch>
+                      <a:fillRect/>
+                    </a:stretch>
+                  </pic:blipFill>
+                  <pic:spPr>
+                    <a:xfrm>
+                      <a:off x="0" y="0"/>
+                      <a:ext cx="5943600" cy="3343275"/>
+                    </a:xfrm>
+                    <a:prstGeom prst="rect">
+                      <a:avLst/>
+                    </a:prstGeom>
+                  </pic:spPr>
+                </pic:pic>
+              </a:graphicData>
+            </a:graphic>
+          </wp:inline>
+        </w:drawing>
+      </w:r>
+      <w:r>
+        <w:rPr>
+          <w:noProof/>
+          <w:color w:val="0D0D0D" w:themeColor="text1" w:themeTint="F2"/>
+        </w:rPr>
+        <w:drawing>
+          <wp:inline distT="0" distB="0" distL="0" distR="0" wp14:anchorId="19E90263" wp14:editId="6567B640">
+            <wp:extent cx="5943600" cy="3343275"/>
+            <wp:effectExtent l="0" t="0" r="0" b="0"/>
+            <wp:docPr id="1984899372" name="Picture 8"/>
+            <wp:cNvGraphicFramePr>
+              <a:graphicFrameLocks xmlns:a="http://schemas.openxmlformats.org/drawingml/2006/main" noChangeAspect="1"/>
+            </wp:cNvGraphicFramePr>
+            <a:graphic xmlns:a="http://schemas.openxmlformats.org/drawingml/2006/main">
+              <a:graphicData uri="http://schemas.openxmlformats.org/drawingml/2006/picture">
+                <pic:pic xmlns:pic="http://schemas.openxmlformats.org/drawingml/2006/picture">
+                  <pic:nvPicPr>
+                    <pic:cNvPr id="1984899372" name="Picture 1984899372"/>
+                    <pic:cNvPicPr/>
+                  </pic:nvPicPr>
+                  <pic:blipFill>
+                    <a:blip r:embed="rId10">
+                      <a:extLst>
+                        <a:ext uri="{28A0092B-C50C-407E-A947-70E740481C1C}">
+                          <a14:useLocalDpi xmlns:a14="http://schemas.microsoft.com/office/drawing/2010/main" val="0"/>
+                        </a:ext>
+                      </a:extLst>
+                    </a:blip>
+                    <a:stretch>
+                      <a:fillRect/>
+                    </a:stretch>
+                  </pic:blipFill>
+                  <pic:spPr>
+                    <a:xfrm>
+                      <a:off x="0" y="0"/>
+                      <a:ext cx="5943600" cy="3343275"/>
+                    </a:xfrm>
+                    <a:prstGeom prst="rect">
+                      <a:avLst/>
+                    </a:prstGeom>
+                  </pic:spPr>
+                </pic:pic>
+              </a:graphicData>
+            </a:graphic>
+          </wp:inline>
+        </w:drawing>
+      </w:r>
+      <w:r>
+        <w:rPr>
+          <w:noProof/>
+          <w:color w:val="0D0D0D" w:themeColor="text1" w:themeTint="F2"/>
+        </w:rPr>
+        <w:lastRenderedPageBreak/>
+        <w:drawing>
+          <wp:inline distT="0" distB="0" distL="0" distR="0" wp14:anchorId="5BC3747C" wp14:editId="56C7A6D7">
+            <wp:extent cx="5943600" cy="3424555"/>
+            <wp:effectExtent l="0" t="0" r="0" b="0"/>
+            <wp:docPr id="1037491602" name="Picture 9"/>
+            <wp:cNvGraphicFramePr>
+              <a:graphicFrameLocks xmlns:a="http://schemas.openxmlformats.org/drawingml/2006/main" noChangeAspect="1"/>
+            </wp:cNvGraphicFramePr>
+            <a:graphic xmlns:a="http://schemas.openxmlformats.org/drawingml/2006/main">
+              <a:graphicData uri="http://schemas.openxmlformats.org/drawingml/2006/picture">
+                <pic:pic xmlns:pic="http://schemas.openxmlformats.org/drawingml/2006/picture">
+                  <pic:nvPicPr>
+                    <pic:cNvPr id="1037491602" name="Picture 1037491602"/>
+                    <pic:cNvPicPr/>
+                  </pic:nvPicPr>
+                  <pic:blipFill>
+                    <a:blip r:embed="rId17">
+                      <a:extLst>
+                        <a:ext uri="{28A0092B-C50C-407E-A947-70E740481C1C}">
+                          <a14:useLocalDpi xmlns:a14="http://schemas.microsoft.com/office/drawing/2010/main" val="0"/>
+                        </a:ext>
+                      </a:extLst>
+                    </a:blip>
+                    <a:stretch>
+                      <a:fillRect/>
+                    </a:stretch>
+                  </pic:blipFill>
+                  <pic:spPr>
+                    <a:xfrm>
+                      <a:off x="0" y="0"/>
+                      <a:ext cx="5943600" cy="3424555"/>
+                    </a:xfrm>
+                    <a:prstGeom prst="rect">
+                      <a:avLst/>
+                    </a:prstGeom>
+                  </pic:spPr>
+                </pic:pic>
+              </a:graphicData>
+            </a:graphic>
+          </wp:inline>
+        </w:drawing>
+      </w:r>
     </w:p>
     <w:sectPr>
       <w:footnotePr>
@@ -3024,7 +3326,7 @@
 </file>
 
 <file path=word/numbering.xml><?xml version="1.0" encoding="utf-8"?>
-<w:numbering xmlns:wpc="http://schemas.microsoft.com/office/word/2010/wordprocessingCanvas" xmlns:cx="http://schemas.microsoft.com/office/drawing/2014/chartex" xmlns:cx1="http://schemas.microsoft.com/office/drawing/2015/9/8/chartex" xmlns:cx2="http://schemas.microsoft.com/office/drawing/2015/10/21/chartex" xmlns:cx3="http://schemas.microsoft.com/office/drawing/2016/5/9/chartex" xmlns:cx4="http://schemas.microsoft.com/office/drawing/2016/5/10/chartex" xmlns:cx5="http://schemas.microsoft.com/office/drawing/2016/5/11/chartex" xmlns:cx6="http://schemas.microsoft.com/office/drawing/2016/5/12/chartex" xmlns:cx7="http://schemas.microsoft.com/office/drawing/2016/5/13/chartex" xmlns:cx8="http://schemas.microsoft.com/office/drawing/2016/5/14/chartex" xmlns:mc="http://schemas.openxmlformats.org/markup-compatibility/2006" xmlns:aink="http://schemas.microsoft.com/office/drawing/2016/ink" xmlns:am3d="http://schemas.microsoft.com/office/drawing/2017/model3d" xmlns:o="urn:schemas-microsoft-com:office:office" xmlns:r="http://schemas.openxmlformats.org/officeDocument/2006/relationships" xmlns:m="http://schemas.openxmlformats.org/officeDocument/2006/math" xmlns:v="urn:schemas-microsoft-com:vml" xmlns:wp14="http://schemas.microsoft.com/office/word/2010/wordprocessingDrawing" xmlns:wp="http://schemas.openxmlformats.org/drawingml/2006/wordprocessingDrawing" xmlns:w10="urn:schemas-microsoft-com:office:word" xmlns:w="http://schemas.openxmlformats.org/wordprocessingml/2006/main" xmlns:w14="http://schemas.microsoft.com/office/word/2010/wordml" xmlns:w15="http://schemas.microsoft.com/office/word/2012/wordml" xmlns:w16cex="http://schemas.microsoft.com/office/word/2018/wordml/cex" xmlns:w16cid="http://schemas.microsoft.com/office/word/2016/wordml/cid" xmlns:w16="http://schemas.microsoft.com/office/word/2018/wordml" xmlns:w16sdtdh="http://schemas.microsoft.com/office/word/2020/wordml/sdtdatahash" xmlns:w16se="http://schemas.microsoft.com/office/word/2015/wordml/symex" xmlns:wpg="http://schemas.microsoft.com/office/word/2010/wordprocessingGroup" xmlns:wpi="http://schemas.microsoft.com/office/word/2010/wordprocessingInk" xmlns:wne="http://schemas.microsoft.com/office/word/2006/wordml" xmlns:wps="http://schemas.microsoft.com/office/word/2010/wordprocessingShape" mc:Ignorable="w14 w15 w16se w16cid w16 w16cex w16sdtdh wp14">
+<w:numbering xmlns:wpc="http://schemas.microsoft.com/office/word/2010/wordprocessingCanvas" xmlns:cx="http://schemas.microsoft.com/office/drawing/2014/chartex" xmlns:cx1="http://schemas.microsoft.com/office/drawing/2015/9/8/chartex" xmlns:cx2="http://schemas.microsoft.com/office/drawing/2015/10/21/chartex" xmlns:cx3="http://schemas.microsoft.com/office/drawing/2016/5/9/chartex" xmlns:cx4="http://schemas.microsoft.com/office/drawing/2016/5/10/chartex" xmlns:cx5="http://schemas.microsoft.com/office/drawing/2016/5/11/chartex" xmlns:cx6="http://schemas.microsoft.com/office/drawing/2016/5/12/chartex" xmlns:cx7="http://schemas.microsoft.com/office/drawing/2016/5/13/chartex" xmlns:cx8="http://schemas.microsoft.com/office/drawing/2016/5/14/chartex" xmlns:mc="http://schemas.openxmlformats.org/markup-compatibility/2006" xmlns:aink="http://schemas.microsoft.com/office/drawing/2016/ink" xmlns:am3d="http://schemas.microsoft.com/office/drawing/2017/model3d" xmlns:o="urn:schemas-microsoft-com:office:office" xmlns:oel="http://schemas.microsoft.com/office/2019/extlst" xmlns:r="http://schemas.openxmlformats.org/officeDocument/2006/relationships" xmlns:m="http://schemas.openxmlformats.org/officeDocument/2006/math" xmlns:v="urn:schemas-microsoft-com:vml" xmlns:wp14="http://schemas.microsoft.com/office/word/2010/wordprocessingDrawing" xmlns:wp="http://schemas.openxmlformats.org/drawingml/2006/wordprocessingDrawing" xmlns:w10="urn:schemas-microsoft-com:office:word" xmlns:w="http://schemas.openxmlformats.org/wordprocessingml/2006/main" xmlns:w14="http://schemas.microsoft.com/office/word/2010/wordml" xmlns:w15="http://schemas.microsoft.com/office/word/2012/wordml" xmlns:w16cex="http://schemas.microsoft.com/office/word/2018/wordml/cex" xmlns:w16cid="http://schemas.microsoft.com/office/word/2016/wordml/cid" xmlns:w16="http://schemas.microsoft.com/office/word/2018/wordml" xmlns:w16du="http://schemas.microsoft.com/office/word/2023/wordml/word16du" xmlns:w16sdtdh="http://schemas.microsoft.com/office/word/2020/wordml/sdtdatahash" xmlns:w16sdtfl="http://schemas.microsoft.com/office/word/2024/wordml/sdtformatlock" xmlns:w16se="http://schemas.microsoft.com/office/word/2015/wordml/symex" xmlns:wpg="http://schemas.microsoft.com/office/word/2010/wordprocessingGroup" xmlns:wpi="http://schemas.microsoft.com/office/word/2010/wordprocessingInk" xmlns:wne="http://schemas.microsoft.com/office/word/2006/wordml" xmlns:wps="http://schemas.microsoft.com/office/word/2010/wordprocessingShape" mc:Ignorable="w14 w15 w16se w16cid w16 w16cex w16sdtdh w16sdtfl w16du wp14">
   <w:abstractNum w:abstractNumId="0" w15:restartNumberingAfterBreak="0">
     <w:nsid w:val="0000A990"/>
     <w:multiLevelType w:val="multilevel"/>
@@ -3535,62 +3837,62 @@
       </w:rPr>
     </w:lvl>
   </w:abstractNum>
-  <w:num w:numId="1">
+  <w:num w:numId="1" w16cid:durableId="1288241616">
     <w:abstractNumId w:val="0"/>
   </w:num>
-  <w:num w:numId="2">
+  <w:num w:numId="2" w16cid:durableId="63338427">
     <w:abstractNumId w:val="1"/>
   </w:num>
-  <w:num w:numId="3">
+  <w:num w:numId="3" w16cid:durableId="322006282">
     <w:abstractNumId w:val="1"/>
   </w:num>
-  <w:num w:numId="4">
+  <w:num w:numId="4" w16cid:durableId="1440372490">
     <w:abstractNumId w:val="1"/>
   </w:num>
-  <w:num w:numId="5">
+  <w:num w:numId="5" w16cid:durableId="1223448653">
     <w:abstractNumId w:val="1"/>
   </w:num>
-  <w:num w:numId="6">
+  <w:num w:numId="6" w16cid:durableId="1425881706">
     <w:abstractNumId w:val="1"/>
   </w:num>
-  <w:num w:numId="7">
+  <w:num w:numId="7" w16cid:durableId="1217427368">
     <w:abstractNumId w:val="1"/>
   </w:num>
-  <w:num w:numId="8">
+  <w:num w:numId="8" w16cid:durableId="1780760567">
     <w:abstractNumId w:val="1"/>
   </w:num>
-  <w:num w:numId="9">
+  <w:num w:numId="9" w16cid:durableId="839808412">
     <w:abstractNumId w:val="1"/>
   </w:num>
-  <w:num w:numId="10">
+  <w:num w:numId="10" w16cid:durableId="332345287">
     <w:abstractNumId w:val="1"/>
   </w:num>
-  <w:num w:numId="11">
+  <w:num w:numId="11" w16cid:durableId="229582789">
     <w:abstractNumId w:val="1"/>
   </w:num>
-  <w:num w:numId="12">
+  <w:num w:numId="12" w16cid:durableId="1186209015">
     <w:abstractNumId w:val="1"/>
   </w:num>
-  <w:num w:numId="13">
+  <w:num w:numId="13" w16cid:durableId="1301959881">
     <w:abstractNumId w:val="1"/>
   </w:num>
-  <w:num w:numId="14">
+  <w:num w:numId="14" w16cid:durableId="70473820">
     <w:abstractNumId w:val="1"/>
   </w:num>
-  <w:num w:numId="15">
+  <w:num w:numId="15" w16cid:durableId="1683318960">
     <w:abstractNumId w:val="2"/>
   </w:num>
-  <w:num w:numId="16">
+  <w:num w:numId="16" w16cid:durableId="1060520831">
     <w:abstractNumId w:val="3"/>
   </w:num>
-  <w:num w:numId="17">
+  <w:num w:numId="17" w16cid:durableId="373506111">
     <w:abstractNumId w:val="4"/>
   </w:num>
 </w:numbering>
 </file>
 
 <file path=word/styles.xml><?xml version="1.0" encoding="utf-8"?>
-<w:styles xmlns:mc="http://schemas.openxmlformats.org/markup-compatibility/2006" xmlns:r="http://schemas.openxmlformats.org/officeDocument/2006/relationships" xmlns:w="http://schemas.openxmlformats.org/wordprocessingml/2006/main" xmlns:w14="http://schemas.microsoft.com/office/word/2010/wordml" xmlns:w15="http://schemas.microsoft.com/office/word/2012/wordml" xmlns:w16cex="http://schemas.microsoft.com/office/word/2018/wordml/cex" xmlns:w16cid="http://schemas.microsoft.com/office/word/2016/wordml/cid" xmlns:w16="http://schemas.microsoft.com/office/word/2018/wordml" xmlns:w16sdtdh="http://schemas.microsoft.com/office/word/2020/wordml/sdtdatahash" xmlns:w16se="http://schemas.microsoft.com/office/word/2015/wordml/symex" mc:Ignorable="w14 w15 w16se w16cid w16 w16cex w16sdtdh">
+<w:styles xmlns:mc="http://schemas.openxmlformats.org/markup-compatibility/2006" xmlns:r="http://schemas.openxmlformats.org/officeDocument/2006/relationships" xmlns:w="http://schemas.openxmlformats.org/wordprocessingml/2006/main" xmlns:w14="http://schemas.microsoft.com/office/word/2010/wordml" xmlns:w15="http://schemas.microsoft.com/office/word/2012/wordml" xmlns:w16cex="http://schemas.microsoft.com/office/word/2018/wordml/cex" xmlns:w16cid="http://schemas.microsoft.com/office/word/2016/wordml/cid" xmlns:w16="http://schemas.microsoft.com/office/word/2018/wordml" xmlns:w16du="http://schemas.microsoft.com/office/word/2023/wordml/word16du" xmlns:w16sdtdh="http://schemas.microsoft.com/office/word/2020/wordml/sdtdatahash" xmlns:w16sdtfl="http://schemas.microsoft.com/office/word/2024/wordml/sdtformatlock" xmlns:w16se="http://schemas.microsoft.com/office/word/2015/wordml/symex" mc:Ignorable="w14 w15 w16se w16cid w16 w16cex w16sdtdh w16sdtfl w16du">
   <w:docDefaults>
     <w:rPrDefault>
       <w:rPr>
@@ -3744,6 +4046,13 @@
     <w:lsdException w:name="Placeholder Text" w:semiHidden="1"/>
     <w:lsdException w:name="Light Shading"/>
     <w:lsdException w:name="Light List"/>
+    <w:lsdException w:name="Light Grid"/>
+    <w:lsdException w:name="Medium Shading 1"/>
+    <w:lsdException w:name="Medium Shading 2"/>
+    <w:lsdException w:name="Medium List 1"/>
+    <w:lsdException w:name="Medium List 2"/>
+    <w:lsdException w:name="Medium Grid 1"/>
+    <w:lsdException w:name="Medium Grid 2"/>
     <w:lsdException w:name="Medium Grid 3"/>
     <w:lsdException w:name="Dark List"/>
     <w:lsdException w:name="Colorful Shading"/>
@@ -3991,7 +4300,6 @@
     <w:next w:val="BodyText"/>
     <w:link w:val="Heading3Char"/>
     <w:uiPriority w:val="9"/>
-    <w:semiHidden/>
     <w:unhideWhenUsed/>
     <w:qFormat/>
     <w:rsid w:val="00A10FD9"/>
@@ -4143,7 +4451,6 @@
   <w:style w:type="character" w:default="1" w:styleId="DefaultParagraphFont">
     <w:name w:val="Default Paragraph Font"/>
     <w:uiPriority w:val="1"/>
-    <w:semiHidden/>
     <w:unhideWhenUsed/>
   </w:style>
   <w:style w:type="table" w:default="1" w:styleId="TableNormal">
@@ -4346,7 +4653,6 @@
     <w:basedOn w:val="DefaultParagraphFont"/>
     <w:link w:val="Heading3"/>
     <w:uiPriority w:val="9"/>
-    <w:semiHidden/>
     <w:rsid w:val="00A10FD9"/>
     <w:rPr>
       <w:rFonts w:eastAsiaTheme="majorEastAsia" w:cstheme="majorBidi"/>

</xml_diff>